<commit_message>
KTLO taalrevisie: anglicismen vervangen, spelling gecorrigeerd, CLAUDE.md bijgewerkt
Nederlands taalregister doorgelicht in KTLO-overeenkomst:
- Beëindiging (trema), dataverlies, adjectieflexie adviseurs
- ~30 anglicismen → Nederlands (monitoring→bewaking, credentials→toegangsgegevens, etc.)
- "Werkzaamheden buiten scope" → Meerwerk, "Security patch" → Beveiligingsupdate
- Artikelkoppen: em-dash → punt, kruisverwijzingen lowercase in lopende tekst
- Structuur: overwegingen-intro, Slotbepalingen, ondertekeningsformule
- CLAUDE.md: Nederlandse taalconventies toegevoegd voor toekomstige documenten
</commit_message>
<xml_diff>
--- a/artifacts/KTLO_Overeenkomst_Dienstverlening_v2.docx
+++ b/artifacts/KTLO_Overeenkomst_Dienstverlening_v2.docx
@@ -981,6 +981,32 @@
       <w:r>
         <w:rPr>
           <w:rFonts w:ascii="Arial" w:cs="Arial" w:eastAsia="Arial" w:hAnsi="Arial"/>
+          <w:sz w:val="22"/>
+          <w:szCs w:val="22"/>
+        </w:rPr>
+        <w:t xml:space="preserve">Partijen nemen het volgende in aanmerking:</w:t>
+      </w:r>
+    </w:p>
+    <w:p>
+      <w:pPr>
+        <w:spacing w:before="100" w:after="100"/>
+      </w:pPr>
+      <w:r>
+        <w:rPr>
+          <w:rFonts w:ascii="Arial" w:cs="Arial" w:eastAsia="Arial" w:hAnsi="Arial"/>
+          <w:sz w:val="22"/>
+          <w:szCs w:val="22"/>
+        </w:rPr>
+        <w:t xml:space="preserve"/>
+      </w:r>
+    </w:p>
+    <w:p>
+      <w:pPr>
+        <w:spacing w:before="100" w:after="100"/>
+      </w:pPr>
+      <w:r>
+        <w:rPr>
+          <w:rFonts w:ascii="Arial" w:cs="Arial" w:eastAsia="Arial" w:hAnsi="Arial"/>
           <w:b/>
           <w:bCs/>
           <w:sz w:val="22"/>
@@ -1156,7 +1182,7 @@
           <w:sz w:val="24"/>
           <w:szCs w:val="24"/>
         </w:rPr>
-        <w:t xml:space="preserve">Artikel 1 — Definities</w:t>
+        <w:t xml:space="preserve">Artikel 1. Definities</w:t>
       </w:r>
     </w:p>
     <w:p>
@@ -1228,7 +1254,7 @@
           <w:sz w:val="22"/>
           <w:szCs w:val="22"/>
         </w:rPr>
-        <w:t xml:space="preserve">De in Artikel 2 omschreven KTLO-werkzaamheden.</w:t>
+        <w:t xml:space="preserve">De in artikel 2 omschreven KTLO-werkzaamheden.</w:t>
       </w:r>
     </w:p>
     <w:p>
@@ -1251,7 +1277,7 @@
           <w:sz w:val="22"/>
           <w:szCs w:val="22"/>
         </w:rPr>
-        <w:t xml:space="preserve">De in Artikel 4 gespecificeerde kosten voor servers, opslag en overige infrastructuur benodigd voor het operationeel houden van het Platform.</w:t>
+        <w:t xml:space="preserve">De in artikel 4 gespecificeerde kosten voor servers, opslag en overige infrastructuur benodigd voor het operationeel houden van het Platform.</w:t>
       </w:r>
     </w:p>
     <w:p>
@@ -1274,53 +1300,53 @@
           <w:sz w:val="22"/>
           <w:szCs w:val="22"/>
         </w:rPr>
-        <w:t xml:space="preserve">Een softwarefout waardoor: (a) het Platform volledig onbereikbaar is; of (b) data verlies of corruptie optreedt; of (c) een security-kwetsbaarheid actief wordt misbruikt; of (d) incorrecte financiële transacties plaatsvinden.</w:t>
-      </w:r>
-    </w:p>
-    <w:p>
-      <w:pPr>
-        <w:spacing w:before="100" w:after="100"/>
-      </w:pPr>
-      <w:r>
-        <w:rPr>
-          <w:rFonts w:ascii="Arial" w:cs="Arial" w:eastAsia="Arial" w:hAnsi="Arial"/>
-          <w:b/>
-          <w:bCs/>
-          <w:sz w:val="22"/>
-          <w:szCs w:val="22"/>
-        </w:rPr>
-        <w:t xml:space="preserve">1.5 Security patch: </w:t>
-      </w:r>
-      <w:r>
-        <w:rPr>
-          <w:rFonts w:ascii="Arial" w:cs="Arial" w:eastAsia="Arial" w:hAnsi="Arial"/>
-          <w:sz w:val="22"/>
-          <w:szCs w:val="22"/>
-        </w:rPr>
-        <w:t xml:space="preserve">Een update ter verhelping van een beveiligingskwetsbaarheid met een CVE-score van 7.0 of hoger (high/critical), of een direct exploiteerbare kwetsbaarheid in een core dependency.</w:t>
-      </w:r>
-    </w:p>
-    <w:p>
-      <w:pPr>
-        <w:spacing w:before="100" w:after="100"/>
-      </w:pPr>
-      <w:r>
-        <w:rPr>
-          <w:rFonts w:ascii="Arial" w:cs="Arial" w:eastAsia="Arial" w:hAnsi="Arial"/>
-          <w:b/>
-          <w:bCs/>
-          <w:sz w:val="22"/>
-          <w:szCs w:val="22"/>
-        </w:rPr>
-        <w:t xml:space="preserve">1.6 Werkzaamheden buiten scope: </w:t>
-      </w:r>
-      <w:r>
-        <w:rPr>
-          <w:rFonts w:ascii="Arial" w:cs="Arial" w:eastAsia="Arial" w:hAnsi="Arial"/>
-          <w:sz w:val="22"/>
-          <w:szCs w:val="22"/>
-        </w:rPr>
-        <w:t xml:space="preserve">Alle werkzaamheden die niet vallen onder de Diensten zoals omschreven in Artikel 2, en nader gespecificeerd in Artikel 3.</w:t>
+        <w:t xml:space="preserve">Een softwarefout waardoor: (a) het Platform volledig onbereikbaar is; of (b) dataverlies of corruptie optreedt; of (c) een security-kwetsbaarheid actief wordt misbruikt; of (d) incorrecte financiële transacties plaatsvinden.</w:t>
+      </w:r>
+    </w:p>
+    <w:p>
+      <w:pPr>
+        <w:spacing w:before="100" w:after="100"/>
+      </w:pPr>
+      <w:r>
+        <w:rPr>
+          <w:rFonts w:ascii="Arial" w:cs="Arial" w:eastAsia="Arial" w:hAnsi="Arial"/>
+          <w:b/>
+          <w:bCs/>
+          <w:sz w:val="22"/>
+          <w:szCs w:val="22"/>
+        </w:rPr>
+        <w:t xml:space="preserve">1.5 Beveiligingsupdate: </w:t>
+      </w:r>
+      <w:r>
+        <w:rPr>
+          <w:rFonts w:ascii="Arial" w:cs="Arial" w:eastAsia="Arial" w:hAnsi="Arial"/>
+          <w:sz w:val="22"/>
+          <w:szCs w:val="22"/>
+        </w:rPr>
+        <w:t xml:space="preserve">Een update ter verhelping van een beveiligingskwetsbaarheid met een CVE-score van 7.0 of hoger (high/critical), of een direct exploiteerbare kwetsbaarheid in een kernafhankelijkheid.</w:t>
+      </w:r>
+    </w:p>
+    <w:p>
+      <w:pPr>
+        <w:spacing w:before="100" w:after="100"/>
+      </w:pPr>
+      <w:r>
+        <w:rPr>
+          <w:rFonts w:ascii="Arial" w:cs="Arial" w:eastAsia="Arial" w:hAnsi="Arial"/>
+          <w:b/>
+          <w:bCs/>
+          <w:sz w:val="22"/>
+          <w:szCs w:val="22"/>
+        </w:rPr>
+        <w:t xml:space="preserve">1.6 Meerwerk: </w:t>
+      </w:r>
+      <w:r>
+        <w:rPr>
+          <w:rFonts w:ascii="Arial" w:cs="Arial" w:eastAsia="Arial" w:hAnsi="Arial"/>
+          <w:sz w:val="22"/>
+          <w:szCs w:val="22"/>
+        </w:rPr>
+        <w:t xml:space="preserve">Alle werkzaamheden die niet vallen onder de Diensten zoals omschreven in artikel 2, en nader gespecificeerd in artikel 3.</w:t>
       </w:r>
     </w:p>
     <w:p>
@@ -1336,7 +1362,7 @@
           <w:sz w:val="24"/>
           <w:szCs w:val="24"/>
         </w:rPr>
-        <w:t xml:space="preserve">Artikel 2 — Scope van de Diensten</w:t>
+        <w:t xml:space="preserve">Artikel 2. Omvang van de Diensten</w:t>
       </w:r>
     </w:p>
     <w:p>
@@ -1392,7 +1418,7 @@
           <w:sz w:val="22"/>
           <w:szCs w:val="22"/>
         </w:rPr>
-        <w:t xml:space="preserve">(a) Monitoring</w:t>
+        <w:t xml:space="preserve">(a) Bewaking en signalering</w:t>
       </w:r>
     </w:p>
     <w:p>
@@ -1406,7 +1432,7 @@
           <w:sz w:val="22"/>
           <w:szCs w:val="22"/>
         </w:rPr>
-        <w:t xml:space="preserve">–  Server monitoring en alerts</w:t>
+        <w:t xml:space="preserve">–  Serverbewaking en meldingen</w:t>
       </w:r>
     </w:p>
     <w:p>
@@ -1420,7 +1446,7 @@
           <w:sz w:val="22"/>
           <w:szCs w:val="22"/>
         </w:rPr>
-        <w:t xml:space="preserve">–  Uptime bewaking</w:t>
+        <w:t xml:space="preserve">–  Beschikbaarheidsbewaking</w:t>
       </w:r>
     </w:p>
     <w:p>
@@ -1434,7 +1460,7 @@
           <w:sz w:val="22"/>
           <w:szCs w:val="22"/>
         </w:rPr>
-        <w:t xml:space="preserve">–  Error tracking</w:t>
+        <w:t xml:space="preserve">–  Foutregistratie</w:t>
       </w:r>
     </w:p>
     <w:p>
@@ -1476,7 +1502,7 @@
           <w:sz w:val="22"/>
           <w:szCs w:val="22"/>
         </w:rPr>
-        <w:t xml:space="preserve">–  Diagnose en herstel van Kritieke bugs zoals gedefinieerd in Artikel 1.4</w:t>
+        <w:t xml:space="preserve">–  Diagnose en herstel van Kritieke bugs zoals gedefinieerd in artikel 1.4</w:t>
       </w:r>
     </w:p>
     <w:p>
@@ -1504,7 +1530,7 @@
           <w:sz w:val="22"/>
           <w:szCs w:val="22"/>
         </w:rPr>
-        <w:t xml:space="preserve">(c) Security patches</w:t>
+        <w:t xml:space="preserve">(c) Beveiligingsupdates</w:t>
       </w:r>
     </w:p>
     <w:p>
@@ -1518,7 +1544,7 @@
           <w:sz w:val="22"/>
           <w:szCs w:val="22"/>
         </w:rPr>
-        <w:t xml:space="preserve">–  Toepassen van Security patches zoals gedefinieerd in Artikel 1.5</w:t>
+        <w:t xml:space="preserve">–  Toepassen van Beveiligingsupdates zoals gedefinieerd in artikel 1.5</w:t>
       </w:r>
     </w:p>
     <w:p>
@@ -1532,7 +1558,7 @@
           <w:sz w:val="22"/>
           <w:szCs w:val="22"/>
         </w:rPr>
-        <w:t xml:space="preserve">–  Updates van core dependencies bij kritieke kwetsbaarheden</w:t>
+        <w:t xml:space="preserve">–  Updates van kernafhankelijkheden bij kritieke kwetsbaarheden</w:t>
       </w:r>
     </w:p>
     <w:p>
@@ -1574,7 +1600,7 @@
           <w:sz w:val="22"/>
           <w:szCs w:val="22"/>
         </w:rPr>
-        <w:t xml:space="preserve">–  Backup verificatie</w:t>
+        <w:t xml:space="preserve">–  Verificatie van back-ups</w:t>
       </w:r>
     </w:p>
     <w:p>
@@ -1588,7 +1614,7 @@
           <w:sz w:val="22"/>
           <w:szCs w:val="22"/>
         </w:rPr>
-        <w:t xml:space="preserve">–  SSL certificaat vernieuwing</w:t>
+        <w:t xml:space="preserve">–  Vernieuwing van SSL-certificaten</w:t>
       </w:r>
     </w:p>
     <w:p>
@@ -1602,7 +1628,7 @@
           <w:sz w:val="22"/>
           <w:szCs w:val="22"/>
         </w:rPr>
-        <w:t xml:space="preserve">–  DNS beheer</w:t>
+        <w:t xml:space="preserve">–  DNS-beheer</w:t>
       </w:r>
     </w:p>
     <w:p>
@@ -1616,7 +1642,7 @@
           <w:sz w:val="22"/>
           <w:szCs w:val="22"/>
         </w:rPr>
-        <w:t xml:space="preserve">–  Standaard database onderhoud</w:t>
+        <w:t xml:space="preserve">–  Standaard databaseonderhoud</w:t>
       </w:r>
     </w:p>
     <w:p>
@@ -1825,7 +1851,7 @@
                 <w:sz w:val="20"/>
                 <w:szCs w:val="20"/>
               </w:rPr>
-              <w:t xml:space="preserve">Platform onbereikbaar, dataverlies, actief security-misbruik</w:t>
+              <w:t xml:space="preserve">Platform onbereikbaar, dataverlies, actieve uitbuiting van een beveiligingslek</w:t>
             </w:r>
           </w:p>
         </w:tc>
@@ -2025,7 +2051,7 @@
                 <w:sz w:val="20"/>
                 <w:szCs w:val="20"/>
               </w:rPr>
-              <w:t xml:space="preserve">Security patch (Art. 1.5), gedeeltelijke functieverstoring</w:t>
+              <w:t xml:space="preserve">Beveiligingsupdate (Art. 1.5), gedeeltelijke functieverstoring</w:t>
             </w:r>
           </w:p>
         </w:tc>
@@ -2125,7 +2151,7 @@
                 <w:sz w:val="20"/>
                 <w:szCs w:val="20"/>
               </w:rPr>
-              <w:t xml:space="preserve">Standaard onderhoud, certificaten, backup-verificatie</w:t>
+              <w:t xml:space="preserve">Standaard onderhoud, certificaten, back-upverificatie</w:t>
             </w:r>
           </w:p>
         </w:tc>
@@ -2256,7 +2282,7 @@
           <w:sz w:val="22"/>
           <w:szCs w:val="22"/>
         </w:rPr>
-        <w:t xml:space="preserve">De Diensten bedragen maximaal 1 uur per week gemiddeld over een kalendermaand. Opdrachtnemer is niet verplicht meer uren te besteden. Indien de Diensten structureel meer dan 1 uur per week vergen, is Artikel 5.3 van toepassing.</w:t>
+        <w:t xml:space="preserve">De Diensten bedragen maximaal 1 uur per week gemiddeld over een kalendermaand. Opdrachtnemer is niet verplicht meer uren te besteden. Indien de Diensten structureel meer dan 1 uur per week vergen, is artikel 5.3 van toepassing.</w:t>
       </w:r>
     </w:p>
     <w:p>
@@ -2284,7 +2310,7 @@
           <w:sz w:val="22"/>
           <w:szCs w:val="22"/>
         </w:rPr>
-        <w:t xml:space="preserve">De volgende werkzaamheden vallen uitdrukkelijk niet onder de Diensten:</w:t>
+        <w:t xml:space="preserve">De volgende werkzaamheden vallen uitdrukkelijk niet onder de Diensten en worden aangemerkt als Meerwerk:</w:t>
       </w:r>
     </w:p>
     <w:p>
@@ -2298,7 +2324,7 @@
           <w:sz w:val="22"/>
           <w:szCs w:val="22"/>
         </w:rPr>
-        <w:t xml:space="preserve">–  Eindgebruiker support, training of onboarding</w:t>
+        <w:t xml:space="preserve">–  Eindgebruikersondersteuning, training of inwerkbegeleiding</w:t>
       </w:r>
     </w:p>
     <w:p>
@@ -2312,7 +2338,7 @@
           <w:sz w:val="22"/>
           <w:szCs w:val="22"/>
         </w:rPr>
-        <w:t xml:space="preserve">–  Nieuwe functionaliteit of feature requests</w:t>
+        <w:t xml:space="preserve">–  Nieuwe functionaliteit of verzoeken tot nieuwe functionaliteit</w:t>
       </w:r>
     </w:p>
     <w:p>
@@ -2368,7 +2394,7 @@
           <w:sz w:val="22"/>
           <w:szCs w:val="22"/>
         </w:rPr>
-        <w:t xml:space="preserve">–  UI/UX verbeteringen of design updates</w:t>
+        <w:t xml:space="preserve">–  Verbeteringen van gebruikersinterface of ontwerp</w:t>
       </w:r>
     </w:p>
     <w:p>
@@ -2382,7 +2408,7 @@
           <w:sz w:val="22"/>
           <w:szCs w:val="22"/>
         </w:rPr>
-        <w:t xml:space="preserve">–  Performance optimalisatie (tenzij sprake van een Kritieke bug)</w:t>
+        <w:t xml:space="preserve">–  Prestatie-optimalisatie (tenzij sprake van een Kritieke bug)</w:t>
       </w:r>
     </w:p>
     <w:p>
@@ -2396,7 +2422,7 @@
           <w:sz w:val="22"/>
           <w:szCs w:val="22"/>
         </w:rPr>
-        <w:t xml:space="preserve">–  Refactoring of architectuurverbeteringen</w:t>
+        <w:t xml:space="preserve">–  Herstructurering van code of architectuurverbeteringen</w:t>
       </w:r>
     </w:p>
     <w:p>
@@ -2410,7 +2436,7 @@
           <w:sz w:val="22"/>
           <w:szCs w:val="22"/>
         </w:rPr>
-        <w:t xml:space="preserve">–  Niet-kritieke bugs (cosmetische issues, minor usability problemen, edge cases)</w:t>
+        <w:t xml:space="preserve">–  Niet-kritieke bugs (cosmetische gebreken, kleine gebruiksproblemen, randgevallen zonder wezenlijke bedrijfsimpact)</w:t>
       </w:r>
     </w:p>
     <w:p>
@@ -2424,7 +2450,7 @@
           <w:sz w:val="22"/>
           <w:szCs w:val="22"/>
         </w:rPr>
-        <w:t xml:space="preserve">–  Documentatie updates</w:t>
+        <w:t xml:space="preserve">–  Bijwerken van documentatie</w:t>
       </w:r>
     </w:p>
     <w:p>
@@ -2438,7 +2464,7 @@
           <w:sz w:val="22"/>
           <w:szCs w:val="22"/>
         </w:rPr>
-        <w:t xml:space="preserve">–  Database optimalisatie (niet-kritiek)</w:t>
+        <w:t xml:space="preserve">–  Database-optimalisatie (niet-kritiek)</w:t>
       </w:r>
     </w:p>
     <w:p>
@@ -2452,7 +2478,7 @@
           <w:sz w:val="22"/>
           <w:szCs w:val="22"/>
         </w:rPr>
-        <w:t xml:space="preserve">–  Caching implementaties</w:t>
+        <w:t xml:space="preserve">–  Cache-implementaties</w:t>
       </w:r>
     </w:p>
     <w:p>
@@ -2496,7 +2522,7 @@
           <w:sz w:val="24"/>
           <w:szCs w:val="24"/>
         </w:rPr>
-        <w:t xml:space="preserve">Artikel 3 — Werkzaamheden buiten scope</w:t>
+        <w:t xml:space="preserve">Artikel 3. Meerwerk</w:t>
       </w:r>
     </w:p>
     <w:p>
@@ -2519,7 +2545,7 @@
           <w:sz w:val="22"/>
           <w:szCs w:val="22"/>
         </w:rPr>
-        <w:t xml:space="preserve">Werkzaamheden buiten scope worden uitsluitend verricht na voorafgaande schriftelijke offerte door Opdrachtnemer en schriftelijke goedkeuring door Opdrachtgever.</w:t>
+        <w:t xml:space="preserve">Meerwerk wordt uitsluitend verricht na voorafgaande schriftelijke offerte door Opdrachtnemer en schriftelijke goedkeuring door Opdrachtgever.</w:t>
       </w:r>
     </w:p>
     <w:p>
@@ -2542,7 +2568,7 @@
           <w:sz w:val="22"/>
           <w:szCs w:val="22"/>
         </w:rPr>
-        <w:t xml:space="preserve">Het uurtarief voor Werkzaamheden buiten scope bedraagt €125,00 exclusief BTW.</w:t>
+        <w:t xml:space="preserve">Het uurtarief voor Meerwerk bedraagt €125,00 exclusief btw.</w:t>
       </w:r>
     </w:p>
     <w:p>
@@ -2565,7 +2591,7 @@
           <w:sz w:val="22"/>
           <w:szCs w:val="22"/>
         </w:rPr>
-        <w:t xml:space="preserve">Opdrachtnemer factureert Werkzaamheden buiten scope maandelijks achteraf op basis van bestede uren.</w:t>
+        <w:t xml:space="preserve">Opdrachtnemer factureert Meerwerk maandelijks achteraf op basis van bestede uren.</w:t>
       </w:r>
     </w:p>
     <w:p>
@@ -2588,7 +2614,7 @@
           <w:sz w:val="22"/>
           <w:szCs w:val="22"/>
         </w:rPr>
-        <w:t xml:space="preserve">Op Werkzaamheden buiten scope zijn de overige bepalingen van deze overeenkomst onverkort van toepassing, tenzij schriftelijk anders overeengekomen.</w:t>
+        <w:t xml:space="preserve">Op Meerwerk zijn de overige bepalingen van deze overeenkomst onverkort van toepassing, tenzij schriftelijk anders overeengekomen.</w:t>
       </w:r>
     </w:p>
     <w:p>
@@ -2604,7 +2630,7 @@
           <w:sz w:val="24"/>
           <w:szCs w:val="24"/>
         </w:rPr>
-        <w:t xml:space="preserve">Artikel 4 — Hostingkosten</w:t>
+        <w:t xml:space="preserve">Artikel 4. Hostingkosten</w:t>
       </w:r>
     </w:p>
     <w:p>
@@ -2920,7 +2946,7 @@
                 <w:sz w:val="20"/>
                 <w:szCs w:val="20"/>
               </w:rPr>
-              <w:t xml:space="preserve">Object Storage (~3.229 GB)</w:t>
+              <w:t xml:space="preserve">Objectopslag (~3.229 GB)</w:t>
             </w:r>
           </w:p>
         </w:tc>
@@ -2994,7 +3020,7 @@
                 <w:sz w:val="20"/>
                 <w:szCs w:val="20"/>
               </w:rPr>
-              <w:t xml:space="preserve">Broncode repository (GitHub Team)</w:t>
+              <w:t xml:space="preserve">Broncoderepository (GitHub Team)</w:t>
             </w:r>
           </w:p>
         </w:tc>
@@ -3068,7 +3094,7 @@
                 <w:sz w:val="20"/>
                 <w:szCs w:val="20"/>
               </w:rPr>
-              <w:t xml:space="preserve">Monitoring (free plan)</w:t>
+              <w:t xml:space="preserve">Bewaking (gratis abonnement)</w:t>
             </w:r>
           </w:p>
         </w:tc>
@@ -3225,7 +3251,7 @@
           <w:sz w:val="20"/>
           <w:szCs w:val="20"/>
         </w:rPr>
-        <w:t xml:space="preserve">Noot: GitHub Team kosten zijn afhankelijk van het aantal gebruikers. Bovenstaand totaal is berekend op basis van 1 gebruiker ($4,00). Bij meerdere gebruikers wordt het totaal evenredig verhoogd.</w:t>
+        <w:t xml:space="preserve">N.B. GitHub Team-kosten zijn afhankelijk van het aantal gebruikers. Bovenstaand totaal is berekend op basis van 1 gebruiker ($4,00). Bij meerdere gebruikers wordt het totaal evenredig verhoogd.</w:t>
       </w:r>
     </w:p>
     <w:p>
@@ -3240,7 +3266,7 @@
           <w:sz w:val="20"/>
           <w:szCs w:val="20"/>
         </w:rPr>
-        <w:t xml:space="preserve">Noot: AppSignal schaalt naar €22,00/maand bij overschrijding van 50K requests/maand (250K requests plan). Cloudflare R2 tarief: $0,015/GB/maand, 10 GB gratis.</w:t>
+        <w:t xml:space="preserve">N.B. AppSignal schaalt naar €22,00/maand bij overschrijding van 50.000 verzoeken per maand (250.000-verzoeken-abonnement). Cloudflare R2 tarief: $0,015/GB/maand, 10 GB gratis.</w:t>
       </w:r>
     </w:p>
     <w:p>
@@ -3368,7 +3394,7 @@
           <w:sz w:val="24"/>
           <w:szCs w:val="24"/>
         </w:rPr>
-        <w:t xml:space="preserve">Artikel 5 — Vergoeding</w:t>
+        <w:t xml:space="preserve">Artikel 5. Vergoeding</w:t>
       </w:r>
     </w:p>
     <w:p>
@@ -3396,7 +3422,7 @@
           <w:sz w:val="22"/>
           <w:szCs w:val="22"/>
         </w:rPr>
-        <w:t xml:space="preserve">De Diensten zoals omschreven in Artikel 2 worden niet gefactureerd. Opdrachtnemer verricht deze werkzaamheden in het belang van het aandeelhouderschap van PHBX Holding B.V. in Opdrachtgever.</w:t>
+        <w:t xml:space="preserve">De Diensten zoals omschreven in artikel 2 worden niet gefactureerd. Opdrachtnemer verricht deze werkzaamheden in het belang van het aandeelhouderschap van PHBX Holding B.V. in Opdrachtgever.</w:t>
       </w:r>
     </w:p>
     <w:p>
@@ -3438,7 +3464,7 @@
           <w:sz w:val="22"/>
           <w:szCs w:val="22"/>
         </w:rPr>
-        <w:t xml:space="preserve">–  (a) de Hostingkosten op grond van Artikel 4; en</w:t>
+        <w:t xml:space="preserve">–  (a) de Hostingkosten op grond van artikel 4; en</w:t>
       </w:r>
     </w:p>
     <w:p>
@@ -3452,7 +3478,7 @@
           <w:sz w:val="22"/>
           <w:szCs w:val="22"/>
         </w:rPr>
-        <w:t xml:space="preserve">–  (b) vergoedingen voor Werkzaamheden buiten scope op grond van Artikel 3.</w:t>
+        <w:t xml:space="preserve">–  (b) vergoedingen voor Meerwerk op grond van artikel 3.</w:t>
       </w:r>
     </w:p>
     <w:p>
@@ -3480,7 +3506,7 @@
           <w:sz w:val="22"/>
           <w:szCs w:val="22"/>
         </w:rPr>
-        <w:t xml:space="preserve">Indien de Diensten gedurende drie opeenvolgende maanden structureel meer dan 1 uur per week vergen, heeft Opdrachtnemer het recht een redelijke vergoeding voor te stellen voor het meerdere. Partijen treden in dat geval in overleg. Komen Partijen niet tot overeenstemming binnen 30 dagen, dan is Opdrachtnemer gerechtigd de maximale inzet terug te brengen tot 1 uur per week of de overeenkomst op te zeggen met inachtneming van de opzegtermijn in Artikel 6.3.</w:t>
+        <w:t xml:space="preserve">Indien de Diensten gedurende drie opeenvolgende maanden structureel meer dan 1 uur per week vergen, heeft Opdrachtnemer het recht een redelijke vergoeding voor te stellen voor het meerdere. Partijen treden in dat geval in overleg. Komen Partijen niet tot overeenstemming binnen 30 dagen, dan is Opdrachtnemer gerechtigd de maximale inzet terug te brengen tot 1 uur per week of de overeenkomst op te zeggen met inachtneming van de opzegtermijn in artikel 6.3.</w:t>
       </w:r>
     </w:p>
     <w:p>
@@ -3496,7 +3522,7 @@
           <w:sz w:val="24"/>
           <w:szCs w:val="24"/>
         </w:rPr>
-        <w:t xml:space="preserve">Artikel 6 — Duur en Beeindiging</w:t>
+        <w:t xml:space="preserve">Artikel 6. Duur en Beëindiging</w:t>
       </w:r>
     </w:p>
     <w:p>
@@ -3595,20 +3621,20 @@
           <w:sz w:val="22"/>
           <w:szCs w:val="22"/>
         </w:rPr>
-        <w:t xml:space="preserve">6.4 Opeisbaarheid bij beeindiging</w:t>
-      </w:r>
-    </w:p>
-    <w:p>
-      <w:pPr>
-        <w:spacing w:before="100" w:after="100"/>
-      </w:pPr>
-      <w:r>
-        <w:rPr>
-          <w:rFonts w:ascii="Arial" w:cs="Arial" w:eastAsia="Arial" w:hAnsi="Arial"/>
-          <w:sz w:val="22"/>
-          <w:szCs w:val="22"/>
-        </w:rPr>
-        <w:t xml:space="preserve">Bij beeindiging van deze overeenkomst — ongeacht de reden — worden alle openstaande facturen van Opdrachtnemer direct en volledig opeisbaar, zonder dat ingebrekestelling is vereist.</w:t>
+        <w:t xml:space="preserve">6.4 Opeisbaarheid bij beëindiging</w:t>
+      </w:r>
+    </w:p>
+    <w:p>
+      <w:pPr>
+        <w:spacing w:before="100" w:after="100"/>
+      </w:pPr>
+      <w:r>
+        <w:rPr>
+          <w:rFonts w:ascii="Arial" w:cs="Arial" w:eastAsia="Arial" w:hAnsi="Arial"/>
+          <w:sz w:val="22"/>
+          <w:szCs w:val="22"/>
+        </w:rPr>
+        <w:t xml:space="preserve">Bij beëindiging van deze overeenkomst — ongeacht de reden — worden alle openstaande facturen van Opdrachtnemer direct en volledig opeisbaar, zonder dat ingebrekestelling is vereist.</w:t>
       </w:r>
     </w:p>
     <w:p>
@@ -3624,7 +3650,7 @@
           <w:sz w:val="24"/>
           <w:szCs w:val="24"/>
         </w:rPr>
-        <w:t xml:space="preserve">Artikel 7 — Opschorting</w:t>
+        <w:t xml:space="preserve">Artikel 7. Opschorting</w:t>
       </w:r>
     </w:p>
     <w:p>
@@ -3680,7 +3706,7 @@
           <w:sz w:val="22"/>
           <w:szCs w:val="22"/>
         </w:rPr>
-        <w:t xml:space="preserve">Opdrachtnemer is niet aansprakelijk voor schade die Opdrachtgever lijdt als gevolg van opschorting op grond van dit artikel, waaronder maar niet beperkt tot: downtime van het Platform, dataverlies, of gederfde inkomsten.</w:t>
+        <w:t xml:space="preserve">Opdrachtnemer is niet aansprakelijk voor schade die Opdrachtgever lijdt als gevolg van opschorting op grond van dit artikel, waaronder maar niet beperkt tot: onbeschikbaarheid van het Platform, dataverlies, of gederfde inkomsten.</w:t>
       </w:r>
     </w:p>
     <w:p>
@@ -3724,7 +3750,7 @@
           <w:sz w:val="24"/>
           <w:szCs w:val="24"/>
         </w:rPr>
-        <w:t xml:space="preserve">Artikel 8 — Intellectueel eigendom</w:t>
+        <w:t xml:space="preserve">Artikel 8. Intellectueel eigendom</w:t>
       </w:r>
     </w:p>
     <w:p>
@@ -3796,7 +3822,7 @@
           <w:sz w:val="24"/>
           <w:szCs w:val="24"/>
         </w:rPr>
-        <w:t xml:space="preserve">Artikel 9 — Aansprakelijkheid</w:t>
+        <w:t xml:space="preserve">Artikel 9. Aansprakelijkheid</w:t>
       </w:r>
     </w:p>
     <w:p>
@@ -3924,7 +3950,7 @@
           <w:sz w:val="24"/>
           <w:szCs w:val="24"/>
         </w:rPr>
-        <w:t xml:space="preserve">Artikel 10 — Beveiliging en Toegangsbeheer</w:t>
+        <w:t xml:space="preserve">Artikel 10. Beveiliging en Toegangsbeheer</w:t>
       </w:r>
     </w:p>
     <w:p>
@@ -3939,20 +3965,20 @@
           <w:sz w:val="22"/>
           <w:szCs w:val="22"/>
         </w:rPr>
-        <w:t xml:space="preserve">10.1 Credential management</w:t>
-      </w:r>
-    </w:p>
-    <w:p>
-      <w:pPr>
-        <w:spacing w:before="100" w:after="100"/>
-      </w:pPr>
-      <w:r>
-        <w:rPr>
-          <w:rFonts w:ascii="Arial" w:cs="Arial" w:eastAsia="Arial" w:hAnsi="Arial"/>
-          <w:sz w:val="22"/>
-          <w:szCs w:val="22"/>
-        </w:rPr>
-        <w:t xml:space="preserve">Opdrachtnemer beheert alle inloggegevens, API-sleutels en overige credentials die benodigd zijn voor de uitvoering van de Diensten uitsluitend via een professionele secrets manager (1Password). Opdrachtnemer deelt geen credentials via e-mail, chatberichten, gedeelde documenten of andere onbeveiligde kanalen.</w:t>
+        <w:t xml:space="preserve">10.1 Beheer van toegangsgegevens</w:t>
+      </w:r>
+    </w:p>
+    <w:p>
+      <w:pPr>
+        <w:spacing w:before="100" w:after="100"/>
+      </w:pPr>
+      <w:r>
+        <w:rPr>
+          <w:rFonts w:ascii="Arial" w:cs="Arial" w:eastAsia="Arial" w:hAnsi="Arial"/>
+          <w:sz w:val="22"/>
+          <w:szCs w:val="22"/>
+        </w:rPr>
+        <w:t xml:space="preserve">Opdrachtnemer beheert alle inloggegevens, API-sleutels en overige toegangsgegevens die benodigd zijn voor de uitvoering van de Diensten uitsluitend via een professionele wachtwoordbeheerder (1Password). Opdrachtnemer deelt geen toegangsgegevens via e-mail, chatberichten, gedeelde documenten of andere onbeveiligde kanalen.</w:t>
       </w:r>
     </w:p>
     <w:p>
@@ -3994,7 +4020,7 @@
           <w:sz w:val="22"/>
           <w:szCs w:val="22"/>
         </w:rPr>
-        <w:t xml:space="preserve">(a) het opslaan van credentials in platte tekst door Opdrachtgever of derden;</w:t>
+        <w:t xml:space="preserve">(a) het opslaan van toegangsgegevens in platte tekst door Opdrachtgever of derden;</w:t>
       </w:r>
     </w:p>
     <w:p>
@@ -4008,7 +4034,7 @@
           <w:sz w:val="22"/>
           <w:szCs w:val="22"/>
         </w:rPr>
-        <w:t xml:space="preserve">(b) het delen van credentials via onbeveiligde kanalen door Opdrachtgever of derden;</w:t>
+        <w:t xml:space="preserve">(b) het delen van toegangsgegevens via onbeveiligde kanalen door Opdrachtgever of derden;</w:t>
       </w:r>
     </w:p>
     <w:p>
@@ -4080,7 +4106,7 @@
           <w:sz w:val="24"/>
           <w:szCs w:val="24"/>
         </w:rPr>
-        <w:t xml:space="preserve">Artikel 11 — Communicatie</w:t>
+        <w:t xml:space="preserve">Artikel 11. Communicatie</w:t>
       </w:r>
     </w:p>
     <w:p>
@@ -4312,7 +4338,7 @@
           <w:sz w:val="22"/>
           <w:szCs w:val="22"/>
         </w:rPr>
-        <w:t xml:space="preserve">Bij P1- en P2-incidenten stuurt Opdrachtgever een e-mail met als onderwerp: "URGENT: [omschrijving probleem]". Bij het uitblijven van een reactie binnen de in Artikel 2.2 genoemde reactietijden kan Opdrachtgever telefonisch contact opnemen.</w:t>
+        <w:t xml:space="preserve">Bij P1- en P2-incidenten stuurt Opdrachtgever een e-mail met als onderwerp: "URGENT: [omschrijving probleem]". Bij het uitblijven van een reactie binnen de in artikel 2.2 genoemde reactietijden kan Opdrachtgever telefonisch contact opnemen.</w:t>
       </w:r>
     </w:p>
     <w:p>
@@ -4328,7 +4354,7 @@
           <w:sz w:val="24"/>
           <w:szCs w:val="24"/>
         </w:rPr>
-        <w:t xml:space="preserve">Artikel 12 — Geheimhouding</w:t>
+        <w:t xml:space="preserve">Artikel 12. Geheimhouding</w:t>
       </w:r>
     </w:p>
     <w:p>
@@ -4384,7 +4410,7 @@
           <w:sz w:val="22"/>
           <w:szCs w:val="22"/>
         </w:rPr>
-        <w:t xml:space="preserve">De geheimhoudingsverplichting geldt niet voor informatie die een Partij deelt met haar juridisch, fiscaal of financieel adviseurs, mits deze adviseurs aan een gelijkwaardige of strengere geheimhoudingsverplichting zijn gebonden.</w:t>
+        <w:t xml:space="preserve">De geheimhoudingsverplichting geldt niet voor informatie die een Partij deelt met haar juridische, fiscale of financiële adviseurs, mits deze adviseurs aan een gelijkwaardige of strengere geheimhoudingsverplichting zijn gebonden.</w:t>
       </w:r>
     </w:p>
     <w:p>
@@ -4440,7 +4466,7 @@
           <w:sz w:val="22"/>
           <w:szCs w:val="22"/>
         </w:rPr>
-        <w:t xml:space="preserve">De geheimhoudingsverplichting blijft van kracht gedurende de looptijd van deze overeenkomst en 2 jaar na beeindiging daarvan.</w:t>
+        <w:t xml:space="preserve">De geheimhoudingsverplichting blijft van kracht gedurende de looptijd van deze overeenkomst en 2 jaar na beëindiging daarvan.</w:t>
       </w:r>
     </w:p>
     <w:p>
@@ -4456,7 +4482,7 @@
           <w:sz w:val="24"/>
           <w:szCs w:val="24"/>
         </w:rPr>
-        <w:t xml:space="preserve">Artikel 13 — Overige Bepalingen</w:t>
+        <w:t xml:space="preserve">Artikel 13. Slotbepalingen</w:t>
       </w:r>
     </w:p>
     <w:p>
@@ -4484,7 +4510,7 @@
           <w:sz w:val="22"/>
           <w:szCs w:val="22"/>
         </w:rPr>
-        <w:t xml:space="preserve">Opdrachtnemer verricht de Diensten als zelfstandig opdrachtnemer. Er is geen sprake van een arbeidsovereenkomst, dienstverband of gezagsverhouding. Opdrachtnemer bepaalt zelfstandig de wijze waarop en de tijdstippen waarop de Diensten worden verricht, binnen de kaders van de in Artikel 2.2 genoemde responstijden.</w:t>
+        <w:t xml:space="preserve">Opdrachtnemer verricht de Diensten als zelfstandig opdrachtnemer. Er is geen sprake van een arbeidsovereenkomst, dienstverband of gezagsverhouding. Opdrachtnemer bepaalt zelfstandig de wijze waarop en de tijdstippen waarop de Diensten worden verricht, binnen de kaders van de in artikel 2.2 genoemde responstijden.</w:t>
       </w:r>
     </w:p>
     <w:p>
@@ -4674,7 +4700,7 @@
           <w:sz w:val="22"/>
           <w:szCs w:val="22"/>
         </w:rPr>
-        <w:t xml:space="preserve">Aldus overeengekomen en in tweevoud ondertekend op 1 maart 2026 te Oosterwolde.</w:t>
+        <w:t xml:space="preserve">Aldus in tweevoud opgesteld en ondertekend op 1 maart 2026 te Oosterwolde.</w:t>
       </w:r>
     </w:p>
     <w:p>

</xml_diff>

<commit_message>
KTLO ondertekening: getekend door Peter, open voor contrasignering
- "In tweevoud" verwijderd (digitale verzending)
- Opdrachtnemer-kant ingevuld: getekend, 9 maart 2026
- Opdrachtgever-kant open voor contrasignering
</commit_message>
<xml_diff>
--- a/artifacts/KTLO_Overeenkomst_Dienstverlening_v2.docx
+++ b/artifacts/KTLO_Overeenkomst_Dienstverlening_v2.docx
@@ -4700,7 +4700,7 @@
           <w:sz w:val="22"/>
           <w:szCs w:val="22"/>
         </w:rPr>
-        <w:t xml:space="preserve">Aldus in tweevoud opgesteld en ondertekend op 1 maart 2026 te Oosterwolde.</w:t>
+        <w:t xml:space="preserve">Aldus opgesteld en ondertekend te Oosterwolde.</w:t>
       </w:r>
     </w:p>
     <w:p>
@@ -4975,7 +4975,7 @@
                 <w:sz w:val="20"/>
                 <w:szCs w:val="20"/>
               </w:rPr>
-              <w:t xml:space="preserve">Handtekening: _________________</w:t>
+              <w:t xml:space="preserve">Handtekening: getekend</w:t>
             </w:r>
           </w:p>
         </w:tc>
@@ -5025,7 +5025,7 @@
                 <w:sz w:val="20"/>
                 <w:szCs w:val="20"/>
               </w:rPr>
-              <w:t xml:space="preserve">Datum: _________________</w:t>
+              <w:t xml:space="preserve">Datum: 9 maart 2026</w:t>
             </w:r>
           </w:p>
         </w:tc>

</xml_diff>

<commit_message>
KTLO ondertekening: handtekeningruimte vergroot, getekend-tekst verwijderd
</commit_message>
<xml_diff>
--- a/artifacts/KTLO_Overeenkomst_Dienstverlening_v2.docx
+++ b/artifacts/KTLO_Overeenkomst_Dienstverlening_v2.docx
@@ -4975,7 +4975,7 @@
                 <w:sz w:val="20"/>
                 <w:szCs w:val="20"/>
               </w:rPr>
-              <w:t xml:space="preserve">Handtekening: getekend</w:t>
+              <w:t xml:space="preserve">Handtekening:</w:t>
             </w:r>
           </w:p>
         </w:tc>
@@ -4999,7 +4999,107 @@
                 <w:sz w:val="20"/>
                 <w:szCs w:val="20"/>
               </w:rPr>
-              <w:t xml:space="preserve">Handtekening: _________________</w:t>
+              <w:t xml:space="preserve">Handtekening:</w:t>
+            </w:r>
+          </w:p>
+        </w:tc>
+      </w:tr>
+      <w:tr>
+        <w:tc>
+          <w:tcPr>
+            <w:tcW w:type="dxa" w:w="4680"/>
+            <w:tcBorders>
+              <w:top w:val="single" w:color="999999" w:sz="1"/>
+              <w:left w:val="single" w:color="999999" w:sz="1"/>
+              <w:bottom w:val="single" w:color="999999" w:sz="1"/>
+              <w:right w:val="single" w:color="999999" w:sz="1"/>
+            </w:tcBorders>
+          </w:tcPr>
+          <w:p>
+            <w:pPr>
+              <w:spacing w:before="40" w:after="40"/>
+            </w:pPr>
+            <w:r>
+              <w:rPr>
+                <w:rFonts w:ascii="Arial" w:cs="Arial" w:eastAsia="Arial" w:hAnsi="Arial"/>
+                <w:sz w:val="20"/>
+                <w:szCs w:val="20"/>
+              </w:rPr>
+              <w:t xml:space="preserve"/>
+            </w:r>
+          </w:p>
+        </w:tc>
+        <w:tc>
+          <w:tcPr>
+            <w:tcW w:type="dxa" w:w="4680"/>
+            <w:tcBorders>
+              <w:top w:val="single" w:color="999999" w:sz="1"/>
+              <w:left w:val="single" w:color="999999" w:sz="1"/>
+              <w:bottom w:val="single" w:color="999999" w:sz="1"/>
+              <w:right w:val="single" w:color="999999" w:sz="1"/>
+            </w:tcBorders>
+          </w:tcPr>
+          <w:p>
+            <w:pPr>
+              <w:spacing w:before="40" w:after="40"/>
+            </w:pPr>
+            <w:r>
+              <w:rPr>
+                <w:rFonts w:ascii="Arial" w:cs="Arial" w:eastAsia="Arial" w:hAnsi="Arial"/>
+                <w:sz w:val="20"/>
+                <w:szCs w:val="20"/>
+              </w:rPr>
+              <w:t xml:space="preserve"/>
+            </w:r>
+          </w:p>
+        </w:tc>
+      </w:tr>
+      <w:tr>
+        <w:tc>
+          <w:tcPr>
+            <w:tcW w:type="dxa" w:w="4680"/>
+            <w:tcBorders>
+              <w:top w:val="single" w:color="999999" w:sz="1"/>
+              <w:left w:val="single" w:color="999999" w:sz="1"/>
+              <w:bottom w:val="single" w:color="999999" w:sz="1"/>
+              <w:right w:val="single" w:color="999999" w:sz="1"/>
+            </w:tcBorders>
+          </w:tcPr>
+          <w:p>
+            <w:pPr>
+              <w:spacing w:before="40" w:after="40"/>
+            </w:pPr>
+            <w:r>
+              <w:rPr>
+                <w:rFonts w:ascii="Arial" w:cs="Arial" w:eastAsia="Arial" w:hAnsi="Arial"/>
+                <w:sz w:val="20"/>
+                <w:szCs w:val="20"/>
+              </w:rPr>
+              <w:t xml:space="preserve"/>
+            </w:r>
+          </w:p>
+        </w:tc>
+        <w:tc>
+          <w:tcPr>
+            <w:tcW w:type="dxa" w:w="4680"/>
+            <w:tcBorders>
+              <w:top w:val="single" w:color="999999" w:sz="1"/>
+              <w:left w:val="single" w:color="999999" w:sz="1"/>
+              <w:bottom w:val="single" w:color="999999" w:sz="1"/>
+              <w:right w:val="single" w:color="999999" w:sz="1"/>
+            </w:tcBorders>
+          </w:tcPr>
+          <w:p>
+            <w:pPr>
+              <w:spacing w:before="40" w:after="40"/>
+            </w:pPr>
+            <w:r>
+              <w:rPr>
+                <w:rFonts w:ascii="Arial" w:cs="Arial" w:eastAsia="Arial" w:hAnsi="Arial"/>
+                <w:sz w:val="20"/>
+                <w:szCs w:val="20"/>
+              </w:rPr>
+              <w:t xml:space="preserve"/>
             </w:r>
           </w:p>
         </w:tc>

</xml_diff>

<commit_message>
Art. 4.5 Migratie naar eigen accounts: infra-overdracht als optie
Nieuw artikel in KTLO-overeenkomst: Dinck kan accounts overnemen met
creditcard, Peter verzorgt migratie + documentatie eenmalig gratis.
Email bijgewerkt met concreet aanbod, strategische notities aangevuld.
</commit_message>
<xml_diff>
--- a/artifacts/KTLO_Overeenkomst_Dienstverlening_v2.docx
+++ b/artifacts/KTLO_Overeenkomst_Dienstverlening_v2.docx
@@ -3365,7 +3365,129 @@
           <w:sz w:val="22"/>
           <w:szCs w:val="22"/>
         </w:rPr>
-        <w:t xml:space="preserve">4.5 Wijzigingen</w:t>
+        <w:t xml:space="preserve">4.5 Migratie naar eigen accounts</w:t>
+      </w:r>
+    </w:p>
+    <w:p>
+      <w:pPr>
+        <w:spacing w:before="100" w:after="100"/>
+      </w:pPr>
+      <w:r>
+        <w:rPr>
+          <w:rFonts w:ascii="Arial" w:cs="Arial" w:eastAsia="Arial" w:hAnsi="Arial"/>
+          <w:sz w:val="22"/>
+          <w:szCs w:val="22"/>
+        </w:rPr>
+        <w:t xml:space="preserve">Op verzoek van Opdrachtgever draagt Opdrachtnemer de hosting- en infrastructuuraccounts eenmalig over naar accounts op naam van Opdrachtgever. Opdrachtgever stelt daartoe de benodigde betaalgegevens (creditcard) ter beschikking. Opdrachtnemer verzorgt de migratie en levert een infrastructuurdocumentatie op met een overzicht van alle servers, diensten, accounts en bijbehorende kosten.</w:t>
+      </w:r>
+    </w:p>
+    <w:p>
+      <w:pPr>
+        <w:spacing w:before="100" w:after="100"/>
+      </w:pPr>
+      <w:r>
+        <w:rPr>
+          <w:rFonts w:ascii="Arial" w:cs="Arial" w:eastAsia="Arial" w:hAnsi="Arial"/>
+          <w:sz w:val="22"/>
+          <w:szCs w:val="22"/>
+        </w:rPr>
+        <w:t xml:space="preserve"/>
+      </w:r>
+    </w:p>
+    <w:p>
+      <w:pPr>
+        <w:spacing w:before="100" w:after="100"/>
+      </w:pPr>
+      <w:r>
+        <w:rPr>
+          <w:rFonts w:ascii="Arial" w:cs="Arial" w:eastAsia="Arial" w:hAnsi="Arial"/>
+          <w:sz w:val="22"/>
+          <w:szCs w:val="22"/>
+        </w:rPr>
+        <w:t xml:space="preserve">Na voltooiing van de migratie:</w:t>
+      </w:r>
+    </w:p>
+    <w:p>
+      <w:pPr>
+        <w:spacing w:before="60" w:after="60"/>
+        <w:ind w:left="720"/>
+      </w:pPr>
+      <w:r>
+        <w:rPr>
+          <w:rFonts w:ascii="Arial" w:cs="Arial" w:eastAsia="Arial" w:hAnsi="Arial"/>
+          <w:sz w:val="22"/>
+          <w:szCs w:val="22"/>
+        </w:rPr>
+        <w:t xml:space="preserve">–  betaalt Opdrachtgever de hostingkosten rechtstreeks aan de onderliggende leveranciers;</w:t>
+      </w:r>
+    </w:p>
+    <w:p>
+      <w:pPr>
+        <w:spacing w:before="60" w:after="60"/>
+        <w:ind w:left="720"/>
+      </w:pPr>
+      <w:r>
+        <w:rPr>
+          <w:rFonts w:ascii="Arial" w:cs="Arial" w:eastAsia="Arial" w:hAnsi="Arial"/>
+          <w:sz w:val="22"/>
+          <w:szCs w:val="22"/>
+        </w:rPr>
+        <w:t xml:space="preserve">–  vervallen de artikelen 4.2, 4.3 en 4.4;</w:t>
+      </w:r>
+    </w:p>
+    <w:p>
+      <w:pPr>
+        <w:spacing w:before="60" w:after="60"/>
+        <w:ind w:left="720"/>
+      </w:pPr>
+      <w:r>
+        <w:rPr>
+          <w:rFonts w:ascii="Arial" w:cs="Arial" w:eastAsia="Arial" w:hAnsi="Arial"/>
+          <w:sz w:val="22"/>
+          <w:szCs w:val="22"/>
+        </w:rPr>
+        <w:t xml:space="preserve">–  blijven de overige bepalingen van deze overeenkomst onverkort van kracht.</w:t>
+      </w:r>
+    </w:p>
+    <w:p>
+      <w:pPr>
+        <w:spacing w:before="100" w:after="100"/>
+      </w:pPr>
+      <w:r>
+        <w:rPr>
+          <w:rFonts w:ascii="Arial" w:cs="Arial" w:eastAsia="Arial" w:hAnsi="Arial"/>
+          <w:sz w:val="22"/>
+          <w:szCs w:val="22"/>
+        </w:rPr>
+        <w:t xml:space="preserve"/>
+      </w:r>
+    </w:p>
+    <w:p>
+      <w:pPr>
+        <w:spacing w:before="100" w:after="100"/>
+      </w:pPr>
+      <w:r>
+        <w:rPr>
+          <w:rFonts w:ascii="Arial" w:cs="Arial" w:eastAsia="Arial" w:hAnsi="Arial"/>
+          <w:sz w:val="22"/>
+          <w:szCs w:val="22"/>
+        </w:rPr>
+        <w:t xml:space="preserve">De migratie en documentatie worden eenmalig verricht zonder aanvullende kosten.</w:t>
+      </w:r>
+    </w:p>
+    <w:p>
+      <w:pPr>
+        <w:spacing w:before="200" w:after="100"/>
+      </w:pPr>
+      <w:r>
+        <w:rPr>
+          <w:rFonts w:ascii="Arial" w:cs="Arial" w:eastAsia="Arial" w:hAnsi="Arial"/>
+          <w:b/>
+          <w:bCs/>
+          <w:sz w:val="22"/>
+          <w:szCs w:val="22"/>
+        </w:rPr>
+        <w:t xml:space="preserve">4.6 Wijzigingen</w:t>
       </w:r>
     </w:p>
     <w:p>

</xml_diff>

<commit_message>
KTLO v2: Hotwire Native scope, Hetzner migratietabel, email bijgewerkt
Contract: API-endpoints → Hotwire Native, SpiekR verwijderd, Dinckly
doorontwikkeling als uitsluiting, Art. 4.1 migratietabel (~€25/mnd),
Art. 4.5 betaalmethode verbreed, datum 10 maart.
Email: toon verzacht, migratieplan benoemd, Art. 4.5 ref gecorrigeerd,
factuur eind maart, v2 framing expliciet.
</commit_message>
<xml_diff>
--- a/artifacts/KTLO_Overeenkomst_Dienstverlening_v2.docx
+++ b/artifacts/KTLO_Overeenkomst_Dienstverlening_v2.docx
@@ -117,7 +117,7 @@
           <w:sz w:val="22"/>
           <w:szCs w:val="22"/>
         </w:rPr>
-        <w:t xml:space="preserve">1 maart 2026</w:t>
+        <w:t xml:space="preserve">10 maart 2026</w:t>
       </w:r>
     </w:p>
     <w:p>
@@ -1231,7 +1231,7 @@
           <w:sz w:val="22"/>
           <w:szCs w:val="22"/>
         </w:rPr>
-        <w:t xml:space="preserve">Het softwareplatform van Opdrachtgever, bereikbaar via app.dinck.nl, inclusief de onderliggende servers, databases en infrastructuur. Het Platform omvat de volledige Rails-applicatie, met inbegrip van de API-endpoints die de Dinckly mobiele applicatie bedienen.</w:t>
+        <w:t xml:space="preserve">Het softwareplatform van Opdrachtgever, bereikbaar via app.dinck.nl, inclusief de onderliggende servers, databases en infrastructuur. Het Platform omvat de volledige Rails-applicatie, met inbegrip van de Hotwire Native-weergaven en bijbehorende code die de Dinckly mobiele applicatie bedienen.</w:t>
       </w:r>
     </w:p>
     <w:p>
@@ -2366,7 +2366,7 @@
           <w:sz w:val="22"/>
           <w:szCs w:val="22"/>
         </w:rPr>
-        <w:t xml:space="preserve">–  Integraties met externe systemen (inclusief maar niet beperkt tot SpiekR)</w:t>
+        <w:t xml:space="preserve">–  Integraties met externe systemen</w:t>
       </w:r>
     </w:p>
     <w:p>
@@ -2380,7 +2380,21 @@
           <w:sz w:val="22"/>
           <w:szCs w:val="22"/>
         </w:rPr>
-        <w:t xml:space="preserve">–  Ontwikkeling, onderhoud of publicatie van mobiele applicaties (iOS en Android), inclusief maar niet beperkt tot de Dinckly app — met dien verstande dat de backend API-endpoints die deze applicaties bedienen wél onderdeel zijn van het Platform (Art. 1.1) en daarmee onder de Diensten vallen</w:t>
+        <w:t xml:space="preserve">–  Ontwikkeling, onderhoud of publicatie van mobiele applicaties (iOS en Android), inclusief maar niet beperkt tot de Dinckly app — met dien verstande dat de Hotwire Native-weergaven en bijbehorende code in de Rails-applicatie die deze mobiele applicaties bedienen wél onderdeel zijn van het Platform (Art. 1.1) en daarmee onder de Diensten vallen</w:t>
+      </w:r>
+    </w:p>
+    <w:p>
+      <w:pPr>
+        <w:spacing w:before="60" w:after="60"/>
+        <w:ind w:left="720"/>
+      </w:pPr>
+      <w:r>
+        <w:rPr>
+          <w:rFonts w:ascii="Arial" w:cs="Arial" w:eastAsia="Arial" w:hAnsi="Arial"/>
+          <w:sz w:val="22"/>
+          <w:szCs w:val="22"/>
+        </w:rPr>
+        <w:t xml:space="preserve">–  Doorontwikkeling van de Dinckly mobiele applicatie, waaronder nieuwe schermen, functionaliteit of aanpassingen aan de native codebase</w:t>
       </w:r>
     </w:p>
     <w:p>
@@ -3271,6 +3285,627 @@
     </w:p>
     <w:p>
       <w:pPr>
+        <w:spacing w:before="100" w:after="100"/>
+      </w:pPr>
+      <w:r>
+        <w:rPr>
+          <w:rFonts w:ascii="Arial" w:cs="Arial" w:eastAsia="Arial" w:hAnsi="Arial"/>
+          <w:sz w:val="22"/>
+          <w:szCs w:val="22"/>
+        </w:rPr>
+        <w:t xml:space="preserve"/>
+      </w:r>
+    </w:p>
+    <w:p>
+      <w:pPr>
+        <w:spacing w:before="100" w:after="100"/>
+      </w:pPr>
+      <w:r>
+        <w:rPr>
+          <w:rFonts w:ascii="Arial" w:cs="Arial" w:eastAsia="Arial" w:hAnsi="Arial"/>
+          <w:b/>
+          <w:bCs/>
+          <w:sz w:val="22"/>
+          <w:szCs w:val="22"/>
+        </w:rPr>
+        <w:t xml:space="preserve">Na migratie (Art. 4.5) — Bij overdracht naar accounts op naam van Opdrachtgever kan de infrastructuur als volgt worden geoptimaliseerd:</w:t>
+      </w:r>
+    </w:p>
+    <w:p>
+      <w:pPr>
+        <w:spacing w:before="100" w:after="100"/>
+      </w:pPr>
+      <w:r>
+        <w:rPr>
+          <w:rFonts w:ascii="Arial" w:cs="Arial" w:eastAsia="Arial" w:hAnsi="Arial"/>
+          <w:sz w:val="22"/>
+          <w:szCs w:val="22"/>
+        </w:rPr>
+        <w:t xml:space="preserve"/>
+      </w:r>
+    </w:p>
+    <w:tbl>
+      <w:tblPr>
+        <w:tblW w:type="auto" w:w="100"/>
+        <w:tblBorders>
+          <w:top w:val="single" w:color="auto" w:sz="4"/>
+          <w:left w:val="single" w:color="auto" w:sz="4"/>
+          <w:bottom w:val="single" w:color="auto" w:sz="4"/>
+          <w:right w:val="single" w:color="auto" w:sz="4"/>
+          <w:insideH w:val="single" w:color="auto" w:sz="4"/>
+          <w:insideV w:val="single" w:color="auto" w:sz="4"/>
+        </w:tblBorders>
+      </w:tblPr>
+      <w:tblGrid>
+        <w:gridCol w:w="3500"/>
+        <w:gridCol w:w="3000"/>
+        <w:gridCol w:w="2860"/>
+      </w:tblGrid>
+      <w:tr>
+        <w:trPr>
+          <w:tblHeader/>
+        </w:trPr>
+        <w:tc>
+          <w:tcPr>
+            <w:tcW w:type="dxa" w:w="3500"/>
+            <w:tcBorders>
+              <w:top w:val="single" w:color="999999" w:sz="1"/>
+              <w:left w:val="single" w:color="999999" w:sz="1"/>
+              <w:bottom w:val="single" w:color="999999" w:sz="1"/>
+              <w:right w:val="single" w:color="999999" w:sz="1"/>
+            </w:tcBorders>
+            <w:shd w:fill="E8E8E8" w:val="clear"/>
+          </w:tcPr>
+          <w:p>
+            <w:pPr>
+              <w:spacing w:before="40" w:after="40"/>
+            </w:pPr>
+            <w:r>
+              <w:rPr>
+                <w:rFonts w:ascii="Arial" w:cs="Arial" w:eastAsia="Arial" w:hAnsi="Arial"/>
+                <w:b/>
+                <w:bCs/>
+                <w:sz w:val="20"/>
+                <w:szCs w:val="20"/>
+              </w:rPr>
+              <w:t xml:space="preserve">Component</w:t>
+            </w:r>
+          </w:p>
+        </w:tc>
+        <w:tc>
+          <w:tcPr>
+            <w:tcW w:type="dxa" w:w="3000"/>
+            <w:tcBorders>
+              <w:top w:val="single" w:color="999999" w:sz="1"/>
+              <w:left w:val="single" w:color="999999" w:sz="1"/>
+              <w:bottom w:val="single" w:color="999999" w:sz="1"/>
+              <w:right w:val="single" w:color="999999" w:sz="1"/>
+            </w:tcBorders>
+            <w:shd w:fill="E8E8E8" w:val="clear"/>
+          </w:tcPr>
+          <w:p>
+            <w:pPr>
+              <w:spacing w:before="40" w:after="40"/>
+            </w:pPr>
+            <w:r>
+              <w:rPr>
+                <w:rFonts w:ascii="Arial" w:cs="Arial" w:eastAsia="Arial" w:hAnsi="Arial"/>
+                <w:b/>
+                <w:bCs/>
+                <w:sz w:val="20"/>
+                <w:szCs w:val="20"/>
+              </w:rPr>
+              <w:t xml:space="preserve">Leverancier</w:t>
+            </w:r>
+          </w:p>
+        </w:tc>
+        <w:tc>
+          <w:tcPr>
+            <w:tcW w:type="dxa" w:w="2860"/>
+            <w:tcBorders>
+              <w:top w:val="single" w:color="999999" w:sz="1"/>
+              <w:left w:val="single" w:color="999999" w:sz="1"/>
+              <w:bottom w:val="single" w:color="999999" w:sz="1"/>
+              <w:right w:val="single" w:color="999999" w:sz="1"/>
+            </w:tcBorders>
+            <w:shd w:fill="E8E8E8" w:val="clear"/>
+          </w:tcPr>
+          <w:p>
+            <w:pPr>
+              <w:spacing w:before="40" w:after="40"/>
+            </w:pPr>
+            <w:r>
+              <w:rPr>
+                <w:rFonts w:ascii="Arial" w:cs="Arial" w:eastAsia="Arial" w:hAnsi="Arial"/>
+                <w:b/>
+                <w:bCs/>
+                <w:sz w:val="20"/>
+                <w:szCs w:val="20"/>
+              </w:rPr>
+              <w:t xml:space="preserve">Maandkosten</w:t>
+            </w:r>
+          </w:p>
+        </w:tc>
+      </w:tr>
+      <w:tr>
+        <w:tc>
+          <w:tcPr>
+            <w:tcW w:type="dxa" w:w="3500"/>
+            <w:tcBorders>
+              <w:top w:val="single" w:color="999999" w:sz="1"/>
+              <w:left w:val="single" w:color="999999" w:sz="1"/>
+              <w:bottom w:val="single" w:color="999999" w:sz="1"/>
+              <w:right w:val="single" w:color="999999" w:sz="1"/>
+            </w:tcBorders>
+          </w:tcPr>
+          <w:p>
+            <w:pPr>
+              <w:spacing w:before="40" w:after="40"/>
+            </w:pPr>
+            <w:r>
+              <w:rPr>
+                <w:rFonts w:ascii="Arial" w:cs="Arial" w:eastAsia="Arial" w:hAnsi="Arial"/>
+                <w:sz w:val="20"/>
+                <w:szCs w:val="20"/>
+              </w:rPr>
+              <w:t xml:space="preserve">Server (4 vCPU, 8 GB RAM, 80 GB NVMe)</w:t>
+            </w:r>
+          </w:p>
+        </w:tc>
+        <w:tc>
+          <w:tcPr>
+            <w:tcW w:type="dxa" w:w="3000"/>
+            <w:tcBorders>
+              <w:top w:val="single" w:color="999999" w:sz="1"/>
+              <w:left w:val="single" w:color="999999" w:sz="1"/>
+              <w:bottom w:val="single" w:color="999999" w:sz="1"/>
+              <w:right w:val="single" w:color="999999" w:sz="1"/>
+            </w:tcBorders>
+          </w:tcPr>
+          <w:p>
+            <w:pPr>
+              <w:spacing w:before="40" w:after="40"/>
+            </w:pPr>
+            <w:r>
+              <w:rPr>
+                <w:rFonts w:ascii="Arial" w:cs="Arial" w:eastAsia="Arial" w:hAnsi="Arial"/>
+                <w:sz w:val="20"/>
+                <w:szCs w:val="20"/>
+              </w:rPr>
+              <w:t xml:space="preserve">Hetzner Cloud</w:t>
+            </w:r>
+          </w:p>
+        </w:tc>
+        <w:tc>
+          <w:tcPr>
+            <w:tcW w:type="dxa" w:w="2860"/>
+            <w:tcBorders>
+              <w:top w:val="single" w:color="999999" w:sz="1"/>
+              <w:left w:val="single" w:color="999999" w:sz="1"/>
+              <w:bottom w:val="single" w:color="999999" w:sz="1"/>
+              <w:right w:val="single" w:color="999999" w:sz="1"/>
+            </w:tcBorders>
+          </w:tcPr>
+          <w:p>
+            <w:pPr>
+              <w:spacing w:before="40" w:after="40"/>
+            </w:pPr>
+            <w:r>
+              <w:rPr>
+                <w:rFonts w:ascii="Arial" w:cs="Arial" w:eastAsia="Arial" w:hAnsi="Arial"/>
+                <w:sz w:val="20"/>
+                <w:szCs w:val="20"/>
+              </w:rPr>
+              <w:t xml:space="preserve">€7,49</w:t>
+            </w:r>
+          </w:p>
+        </w:tc>
+      </w:tr>
+      <w:tr>
+        <w:tc>
+          <w:tcPr>
+            <w:tcW w:type="dxa" w:w="3500"/>
+            <w:tcBorders>
+              <w:top w:val="single" w:color="999999" w:sz="1"/>
+              <w:left w:val="single" w:color="999999" w:sz="1"/>
+              <w:bottom w:val="single" w:color="999999" w:sz="1"/>
+              <w:right w:val="single" w:color="999999" w:sz="1"/>
+            </w:tcBorders>
+          </w:tcPr>
+          <w:p>
+            <w:pPr>
+              <w:spacing w:before="40" w:after="40"/>
+            </w:pPr>
+            <w:r>
+              <w:rPr>
+                <w:rFonts w:ascii="Arial" w:cs="Arial" w:eastAsia="Arial" w:hAnsi="Arial"/>
+                <w:sz w:val="20"/>
+                <w:szCs w:val="20"/>
+              </w:rPr>
+              <w:t xml:space="preserve">Geautomatiseerde serverback-ups</w:t>
+            </w:r>
+          </w:p>
+        </w:tc>
+        <w:tc>
+          <w:tcPr>
+            <w:tcW w:type="dxa" w:w="3000"/>
+            <w:tcBorders>
+              <w:top w:val="single" w:color="999999" w:sz="1"/>
+              <w:left w:val="single" w:color="999999" w:sz="1"/>
+              <w:bottom w:val="single" w:color="999999" w:sz="1"/>
+              <w:right w:val="single" w:color="999999" w:sz="1"/>
+            </w:tcBorders>
+          </w:tcPr>
+          <w:p>
+            <w:pPr>
+              <w:spacing w:before="40" w:after="40"/>
+            </w:pPr>
+            <w:r>
+              <w:rPr>
+                <w:rFonts w:ascii="Arial" w:cs="Arial" w:eastAsia="Arial" w:hAnsi="Arial"/>
+                <w:sz w:val="20"/>
+                <w:szCs w:val="20"/>
+              </w:rPr>
+              <w:t xml:space="preserve">Hetzner Cloud</w:t>
+            </w:r>
+          </w:p>
+        </w:tc>
+        <w:tc>
+          <w:tcPr>
+            <w:tcW w:type="dxa" w:w="2860"/>
+            <w:tcBorders>
+              <w:top w:val="single" w:color="999999" w:sz="1"/>
+              <w:left w:val="single" w:color="999999" w:sz="1"/>
+              <w:bottom w:val="single" w:color="999999" w:sz="1"/>
+              <w:right w:val="single" w:color="999999" w:sz="1"/>
+            </w:tcBorders>
+          </w:tcPr>
+          <w:p>
+            <w:pPr>
+              <w:spacing w:before="40" w:after="40"/>
+            </w:pPr>
+            <w:r>
+              <w:rPr>
+                <w:rFonts w:ascii="Arial" w:cs="Arial" w:eastAsia="Arial" w:hAnsi="Arial"/>
+                <w:sz w:val="20"/>
+                <w:szCs w:val="20"/>
+              </w:rPr>
+              <w:t xml:space="preserve">€1,50</w:t>
+            </w:r>
+          </w:p>
+        </w:tc>
+      </w:tr>
+      <w:tr>
+        <w:tc>
+          <w:tcPr>
+            <w:tcW w:type="dxa" w:w="3500"/>
+            <w:tcBorders>
+              <w:top w:val="single" w:color="999999" w:sz="1"/>
+              <w:left w:val="single" w:color="999999" w:sz="1"/>
+              <w:bottom w:val="single" w:color="999999" w:sz="1"/>
+              <w:right w:val="single" w:color="999999" w:sz="1"/>
+            </w:tcBorders>
+          </w:tcPr>
+          <w:p>
+            <w:pPr>
+              <w:spacing w:before="40" w:after="40"/>
+            </w:pPr>
+            <w:r>
+              <w:rPr>
+                <w:rFonts w:ascii="Arial" w:cs="Arial" w:eastAsia="Arial" w:hAnsi="Arial"/>
+                <w:sz w:val="20"/>
+                <w:szCs w:val="20"/>
+              </w:rPr>
+              <w:t xml:space="preserve">Objectopslag (~3,2 TB, S3-compatibel)</w:t>
+            </w:r>
+          </w:p>
+        </w:tc>
+        <w:tc>
+          <w:tcPr>
+            <w:tcW w:type="dxa" w:w="3000"/>
+            <w:tcBorders>
+              <w:top w:val="single" w:color="999999" w:sz="1"/>
+              <w:left w:val="single" w:color="999999" w:sz="1"/>
+              <w:bottom w:val="single" w:color="999999" w:sz="1"/>
+              <w:right w:val="single" w:color="999999" w:sz="1"/>
+            </w:tcBorders>
+          </w:tcPr>
+          <w:p>
+            <w:pPr>
+              <w:spacing w:before="40" w:after="40"/>
+            </w:pPr>
+            <w:r>
+              <w:rPr>
+                <w:rFonts w:ascii="Arial" w:cs="Arial" w:eastAsia="Arial" w:hAnsi="Arial"/>
+                <w:sz w:val="20"/>
+                <w:szCs w:val="20"/>
+              </w:rPr>
+              <w:t xml:space="preserve">Hetzner Object Storage</w:t>
+            </w:r>
+          </w:p>
+        </w:tc>
+        <w:tc>
+          <w:tcPr>
+            <w:tcW w:type="dxa" w:w="2860"/>
+            <w:tcBorders>
+              <w:top w:val="single" w:color="999999" w:sz="1"/>
+              <w:left w:val="single" w:color="999999" w:sz="1"/>
+              <w:bottom w:val="single" w:color="999999" w:sz="1"/>
+              <w:right w:val="single" w:color="999999" w:sz="1"/>
+            </w:tcBorders>
+          </w:tcPr>
+          <w:p>
+            <w:pPr>
+              <w:spacing w:before="40" w:after="40"/>
+            </w:pPr>
+            <w:r>
+              <w:rPr>
+                <w:rFonts w:ascii="Arial" w:cs="Arial" w:eastAsia="Arial" w:hAnsi="Arial"/>
+                <w:sz w:val="20"/>
+                <w:szCs w:val="20"/>
+              </w:rPr>
+              <w:t xml:space="preserve">~€16,00</w:t>
+            </w:r>
+          </w:p>
+        </w:tc>
+      </w:tr>
+      <w:tr>
+        <w:tc>
+          <w:tcPr>
+            <w:tcW w:type="dxa" w:w="3500"/>
+            <w:tcBorders>
+              <w:top w:val="single" w:color="999999" w:sz="1"/>
+              <w:left w:val="single" w:color="999999" w:sz="1"/>
+              <w:bottom w:val="single" w:color="999999" w:sz="1"/>
+              <w:right w:val="single" w:color="999999" w:sz="1"/>
+            </w:tcBorders>
+          </w:tcPr>
+          <w:p>
+            <w:pPr>
+              <w:spacing w:before="40" w:after="40"/>
+            </w:pPr>
+            <w:r>
+              <w:rPr>
+                <w:rFonts w:ascii="Arial" w:cs="Arial" w:eastAsia="Arial" w:hAnsi="Arial"/>
+                <w:sz w:val="20"/>
+                <w:szCs w:val="20"/>
+              </w:rPr>
+              <w:t xml:space="preserve">Broncoderepository + container registry</w:t>
+            </w:r>
+          </w:p>
+        </w:tc>
+        <w:tc>
+          <w:tcPr>
+            <w:tcW w:type="dxa" w:w="3000"/>
+            <w:tcBorders>
+              <w:top w:val="single" w:color="999999" w:sz="1"/>
+              <w:left w:val="single" w:color="999999" w:sz="1"/>
+              <w:bottom w:val="single" w:color="999999" w:sz="1"/>
+              <w:right w:val="single" w:color="999999" w:sz="1"/>
+            </w:tcBorders>
+          </w:tcPr>
+          <w:p>
+            <w:pPr>
+              <w:spacing w:before="40" w:after="40"/>
+            </w:pPr>
+            <w:r>
+              <w:rPr>
+                <w:rFonts w:ascii="Arial" w:cs="Arial" w:eastAsia="Arial" w:hAnsi="Arial"/>
+                <w:sz w:val="20"/>
+                <w:szCs w:val="20"/>
+              </w:rPr>
+              <w:t xml:space="preserve">GitHub Free</w:t>
+            </w:r>
+          </w:p>
+        </w:tc>
+        <w:tc>
+          <w:tcPr>
+            <w:tcW w:type="dxa" w:w="2860"/>
+            <w:tcBorders>
+              <w:top w:val="single" w:color="999999" w:sz="1"/>
+              <w:left w:val="single" w:color="999999" w:sz="1"/>
+              <w:bottom w:val="single" w:color="999999" w:sz="1"/>
+              <w:right w:val="single" w:color="999999" w:sz="1"/>
+            </w:tcBorders>
+          </w:tcPr>
+          <w:p>
+            <w:pPr>
+              <w:spacing w:before="40" w:after="40"/>
+            </w:pPr>
+            <w:r>
+              <w:rPr>
+                <w:rFonts w:ascii="Arial" w:cs="Arial" w:eastAsia="Arial" w:hAnsi="Arial"/>
+                <w:sz w:val="20"/>
+                <w:szCs w:val="20"/>
+              </w:rPr>
+              <w:t xml:space="preserve">€0,00</w:t>
+            </w:r>
+          </w:p>
+        </w:tc>
+      </w:tr>
+      <w:tr>
+        <w:tc>
+          <w:tcPr>
+            <w:tcW w:type="dxa" w:w="3500"/>
+            <w:tcBorders>
+              <w:top w:val="single" w:color="999999" w:sz="1"/>
+              <w:left w:val="single" w:color="999999" w:sz="1"/>
+              <w:bottom w:val="single" w:color="999999" w:sz="1"/>
+              <w:right w:val="single" w:color="999999" w:sz="1"/>
+            </w:tcBorders>
+          </w:tcPr>
+          <w:p>
+            <w:pPr>
+              <w:spacing w:before="40" w:after="40"/>
+            </w:pPr>
+            <w:r>
+              <w:rPr>
+                <w:rFonts w:ascii="Arial" w:cs="Arial" w:eastAsia="Arial" w:hAnsi="Arial"/>
+                <w:sz w:val="20"/>
+                <w:szCs w:val="20"/>
+              </w:rPr>
+              <w:t xml:space="preserve">Bewaking (gratis abonnement)</w:t>
+            </w:r>
+          </w:p>
+        </w:tc>
+        <w:tc>
+          <w:tcPr>
+            <w:tcW w:type="dxa" w:w="3000"/>
+            <w:tcBorders>
+              <w:top w:val="single" w:color="999999" w:sz="1"/>
+              <w:left w:val="single" w:color="999999" w:sz="1"/>
+              <w:bottom w:val="single" w:color="999999" w:sz="1"/>
+              <w:right w:val="single" w:color="999999" w:sz="1"/>
+            </w:tcBorders>
+          </w:tcPr>
+          <w:p>
+            <w:pPr>
+              <w:spacing w:before="40" w:after="40"/>
+            </w:pPr>
+            <w:r>
+              <w:rPr>
+                <w:rFonts w:ascii="Arial" w:cs="Arial" w:eastAsia="Arial" w:hAnsi="Arial"/>
+                <w:sz w:val="20"/>
+                <w:szCs w:val="20"/>
+              </w:rPr>
+              <w:t xml:space="preserve">AppSignal</w:t>
+            </w:r>
+          </w:p>
+        </w:tc>
+        <w:tc>
+          <w:tcPr>
+            <w:tcW w:type="dxa" w:w="2860"/>
+            <w:tcBorders>
+              <w:top w:val="single" w:color="999999" w:sz="1"/>
+              <w:left w:val="single" w:color="999999" w:sz="1"/>
+              <w:bottom w:val="single" w:color="999999" w:sz="1"/>
+              <w:right w:val="single" w:color="999999" w:sz="1"/>
+            </w:tcBorders>
+          </w:tcPr>
+          <w:p>
+            <w:pPr>
+              <w:spacing w:before="40" w:after="40"/>
+            </w:pPr>
+            <w:r>
+              <w:rPr>
+                <w:rFonts w:ascii="Arial" w:cs="Arial" w:eastAsia="Arial" w:hAnsi="Arial"/>
+                <w:sz w:val="20"/>
+                <w:szCs w:val="20"/>
+              </w:rPr>
+              <w:t xml:space="preserve">€0,00</w:t>
+            </w:r>
+          </w:p>
+        </w:tc>
+      </w:tr>
+      <w:tr>
+        <w:tc>
+          <w:tcPr>
+            <w:tcW w:type="dxa" w:w="3500"/>
+            <w:tcBorders>
+              <w:top w:val="single" w:color="999999" w:sz="1"/>
+              <w:left w:val="single" w:color="999999" w:sz="1"/>
+              <w:bottom w:val="single" w:color="999999" w:sz="1"/>
+              <w:right w:val="single" w:color="999999" w:sz="1"/>
+            </w:tcBorders>
+          </w:tcPr>
+          <w:p>
+            <w:pPr>
+              <w:spacing w:before="40" w:after="40"/>
+            </w:pPr>
+            <w:r>
+              <w:rPr>
+                <w:rFonts w:ascii="Arial" w:cs="Arial" w:eastAsia="Arial" w:hAnsi="Arial"/>
+                <w:b/>
+                <w:bCs/>
+                <w:sz w:val="20"/>
+                <w:szCs w:val="20"/>
+              </w:rPr>
+              <w:t xml:space="preserve">Totaal</w:t>
+            </w:r>
+          </w:p>
+        </w:tc>
+        <w:tc>
+          <w:tcPr>
+            <w:tcW w:type="dxa" w:w="3000"/>
+            <w:tcBorders>
+              <w:top w:val="single" w:color="999999" w:sz="1"/>
+              <w:left w:val="single" w:color="999999" w:sz="1"/>
+              <w:bottom w:val="single" w:color="999999" w:sz="1"/>
+              <w:right w:val="single" w:color="999999" w:sz="1"/>
+            </w:tcBorders>
+          </w:tcPr>
+          <w:p>
+            <w:pPr>
+              <w:spacing w:before="40" w:after="40"/>
+            </w:pPr>
+            <w:r>
+              <w:rPr>
+                <w:rFonts w:ascii="Arial" w:cs="Arial" w:eastAsia="Arial" w:hAnsi="Arial"/>
+                <w:sz w:val="20"/>
+                <w:szCs w:val="20"/>
+              </w:rPr>
+              <w:t xml:space="preserve"/>
+            </w:r>
+          </w:p>
+        </w:tc>
+        <w:tc>
+          <w:tcPr>
+            <w:tcW w:type="dxa" w:w="2860"/>
+            <w:tcBorders>
+              <w:top w:val="single" w:color="999999" w:sz="1"/>
+              <w:left w:val="single" w:color="999999" w:sz="1"/>
+              <w:bottom w:val="single" w:color="999999" w:sz="1"/>
+              <w:right w:val="single" w:color="999999" w:sz="1"/>
+            </w:tcBorders>
+          </w:tcPr>
+          <w:p>
+            <w:pPr>
+              <w:spacing w:before="40" w:after="40"/>
+            </w:pPr>
+            <w:r>
+              <w:rPr>
+                <w:rFonts w:ascii="Arial" w:cs="Arial" w:eastAsia="Arial" w:hAnsi="Arial"/>
+                <w:b/>
+                <w:bCs/>
+                <w:sz w:val="20"/>
+                <w:szCs w:val="20"/>
+              </w:rPr>
+              <w:t xml:space="preserve">~€25/maand</w:t>
+            </w:r>
+          </w:p>
+        </w:tc>
+      </w:tr>
+    </w:tbl>
+    <w:p>
+      <w:pPr>
+        <w:spacing w:before="100" w:after="100"/>
+      </w:pPr>
+      <w:r>
+        <w:rPr>
+          <w:rFonts w:ascii="Arial" w:cs="Arial" w:eastAsia="Arial" w:hAnsi="Arial"/>
+          <w:sz w:val="22"/>
+          <w:szCs w:val="22"/>
+        </w:rPr>
+        <w:t xml:space="preserve"/>
+      </w:r>
+    </w:p>
+    <w:p>
+      <w:pPr>
+        <w:spacing w:before="100" w:after="100"/>
+      </w:pPr>
+      <w:r>
+        <w:rPr>
+          <w:rFonts w:ascii="Arial" w:cs="Arial" w:eastAsia="Arial" w:hAnsi="Arial"/>
+          <w:i/>
+          <w:iCs/>
+          <w:sz w:val="20"/>
+          <w:szCs w:val="20"/>
+        </w:rPr>
+        <w:t xml:space="preserve">Deze optimalisatie vervangt Hatchbox door Kamal (gratis, open-source), consolideert drie Linode-servers naar één Hetzner-server, en verplaatst de objectopslag naar Hetzner Object Storage. De migratie wordt eenmalig verricht zonder aanvullende kosten. Een gedetailleerd migratieplan met gefaseerde stappen is beschikbaar.</w:t>
+      </w:r>
+    </w:p>
+    <w:p>
+      <w:pPr>
         <w:spacing w:before="200" w:after="100"/>
       </w:pPr>
       <w:r>
@@ -3378,7 +4013,7 @@
           <w:sz w:val="22"/>
           <w:szCs w:val="22"/>
         </w:rPr>
-        <w:t xml:space="preserve">Op verzoek van Opdrachtgever draagt Opdrachtnemer de hosting- en infrastructuuraccounts eenmalig over naar accounts op naam van Opdrachtgever. Opdrachtgever stelt daartoe de benodigde betaalgegevens (creditcard) ter beschikking. Opdrachtnemer verzorgt de migratie en levert een infrastructuurdocumentatie op met een overzicht van alle servers, diensten, accounts en bijbehorende kosten.</w:t>
+        <w:t xml:space="preserve">Op verzoek van Opdrachtgever draagt Opdrachtnemer de hosting- en infrastructuuraccounts eenmalig over naar accounts op naam van Opdrachtgever. Opdrachtgever stelt daartoe de benodigde betaalgegevens (creditcard of automatische incasso) ter beschikking. Opdrachtnemer verzorgt de migratie en levert een infrastructuurdocumentatie op met een overzicht van alle servers, diensten, accounts en bijbehorende kosten.</w:t>
       </w:r>
     </w:p>
     <w:p>
@@ -5247,7 +5882,7 @@
                 <w:sz w:val="20"/>
                 <w:szCs w:val="20"/>
               </w:rPr>
-              <w:t xml:space="preserve">Datum: 9 maart 2026</w:t>
+              <w:t xml:space="preserve">Datum: 10 maart 2026</w:t>
             </w:r>
           </w:p>
         </w:tc>

</xml_diff>

<commit_message>
Objectopslag → opslag: anglicisme gecorrigeerd
</commit_message>
<xml_diff>
--- a/artifacts/KTLO_Overeenkomst_Dienstverlening_v2.docx
+++ b/artifacts/KTLO_Overeenkomst_Dienstverlening_v2.docx
@@ -2960,7 +2960,7 @@
                 <w:sz w:val="20"/>
                 <w:szCs w:val="20"/>
               </w:rPr>
-              <w:t xml:space="preserve">Objectopslag (~3.229 GB)</w:t>
+              <w:t xml:space="preserve">Opslag (~3.229 GB)</w:t>
             </w:r>
           </w:p>
         </w:tc>
@@ -3596,7 +3596,7 @@
                 <w:sz w:val="20"/>
                 <w:szCs w:val="20"/>
               </w:rPr>
-              <w:t xml:space="preserve">Objectopslag (~3,2 TB, S3-compatibel)</w:t>
+              <w:t xml:space="preserve">Opslag (~3,2 TB, S3-compatibel)</w:t>
             </w:r>
           </w:p>
         </w:tc>
@@ -3901,7 +3901,7 @@
           <w:sz w:val="20"/>
           <w:szCs w:val="20"/>
         </w:rPr>
-        <w:t xml:space="preserve">Deze optimalisatie vervangt Hatchbox door Kamal (gratis, open-source), consolideert drie Linode-servers naar één Hetzner-server, en verplaatst de objectopslag naar Hetzner Object Storage. De migratie wordt eenmalig verricht zonder aanvullende kosten. Een gedetailleerd migratieplan met gefaseerde stappen is beschikbaar.</w:t>
+        <w:t xml:space="preserve">Deze optimalisatie vervangt Hatchbox door Kamal (gratis, open-source), consolideert drie Linode-servers naar één Hetzner-server, en verplaatst de opslag naar Hetzner Object Storage. De migratie wordt eenmalig verricht zonder aanvullende kosten. Een gedetailleerd migratieplan met gefaseerde stappen is beschikbaar.</w:t>
       </w:r>
     </w:p>
     <w:p>

</xml_diff>

<commit_message>
R2-data bijgewerkt met werkelijke bucketomvang (~3,9 TB)
Alle bestanden bijgewerkt op basis van werkelijke Cloudflare R2-data:
- dinck: 228,94 GB, dinck-database-backups: 77 MB, dinck-google-drive-backup: 3,68 TB
- Huidige hosting: ~$134/mnd (~€123), na migratie: ~€28/mnd, besparing: ~€95/mnd
</commit_message>
<xml_diff>
--- a/artifacts/KTLO_Overeenkomst_Dienstverlening_v2.docx
+++ b/artifacts/KTLO_Overeenkomst_Dienstverlening_v2.docx
@@ -2960,7 +2960,7 @@
                 <w:sz w:val="20"/>
                 <w:szCs w:val="20"/>
               </w:rPr>
-              <w:t xml:space="preserve">Opslag (~3.229 GB)</w:t>
+              <w:t xml:space="preserve">Opslag (~3,9 TB)</w:t>
             </w:r>
           </w:p>
         </w:tc>
@@ -3008,7 +3008,7 @@
                 <w:sz w:val="20"/>
                 <w:szCs w:val="20"/>
               </w:rPr>
-              <w:t xml:space="preserve">~$48,30</w:t>
+              <w:t xml:space="preserve">~$58,65</w:t>
             </w:r>
           </w:p>
         </w:tc>
@@ -3234,7 +3234,7 @@
                 <w:sz w:val="20"/>
                 <w:szCs w:val="20"/>
               </w:rPr>
-              <w:t xml:space="preserve">~$123,30/mnd (~€114)</w:t>
+              <w:t xml:space="preserve">~$133,65/mnd (~€123)</w:t>
             </w:r>
           </w:p>
         </w:tc>
@@ -3596,7 +3596,7 @@
                 <w:sz w:val="20"/>
                 <w:szCs w:val="20"/>
               </w:rPr>
-              <w:t xml:space="preserve">Opslag (~3,2 TB, S3-compatibel)</w:t>
+              <w:t xml:space="preserve">Opslag (~3,9 TB, S3-compatibel)</w:t>
             </w:r>
           </w:p>
         </w:tc>
@@ -3644,7 +3644,7 @@
                 <w:sz w:val="20"/>
                 <w:szCs w:val="20"/>
               </w:rPr>
-              <w:t xml:space="preserve">~€16,00</w:t>
+              <w:t xml:space="preserve">~€19,00</w:t>
             </w:r>
           </w:p>
         </w:tc>
@@ -3870,7 +3870,7 @@
                 <w:sz w:val="20"/>
                 <w:szCs w:val="20"/>
               </w:rPr>
-              <w:t xml:space="preserve">~€25/maand</w:t>
+              <w:t xml:space="preserve">~€28/maand</w:t>
             </w:r>
           </w:p>
         </w:tc>

</xml_diff>

<commit_message>
KTLO v2 docx bijgewerkt: migratie als feit in Art. 4
</commit_message>
<xml_diff>
--- a/artifacts/KTLO_Overeenkomst_Dienstverlening_v2.docx
+++ b/artifacts/KTLO_Overeenkomst_Dienstverlening_v2.docx
@@ -2669,10 +2669,12 @@
       <w:r>
         <w:rPr>
           <w:rFonts w:ascii="Arial" w:cs="Arial" w:eastAsia="Arial" w:hAnsi="Arial"/>
-          <w:sz w:val="22"/>
-          <w:szCs w:val="22"/>
-        </w:rPr>
-        <w:t xml:space="preserve">Het Platform draait op de volgende infrastructuur:</w:t>
+          <w:b/>
+          <w:bCs/>
+          <w:sz w:val="22"/>
+          <w:szCs w:val="22"/>
+        </w:rPr>
+        <w:t xml:space="preserve">Huidige situatie (tot voltooiing migratie Art. 4.5) — Het Platform draait op de volgende infrastructuur:</w:t>
       </w:r>
     </w:p>
     <w:p>
@@ -3308,7 +3310,7 @@
           <w:sz w:val="22"/>
           <w:szCs w:val="22"/>
         </w:rPr>
-        <w:t xml:space="preserve">Na migratie (Art. 4.5) — Bij overdracht naar accounts op naam van Opdrachtgever kan de infrastructuur als volgt worden geoptimaliseerd:</w:t>
+        <w:t xml:space="preserve">Na migratie (Art. 4.5) — Na overdracht naar accounts op naam van Opdrachtgever wordt de infrastructuur als volgt geoptimaliseerd:</w:t>
       </w:r>
     </w:p>
     <w:p>
@@ -3906,6 +3908,34 @@
     </w:p>
     <w:p>
       <w:pPr>
+        <w:spacing w:before="100" w:after="100"/>
+      </w:pPr>
+      <w:r>
+        <w:rPr>
+          <w:rFonts w:ascii="Arial" w:cs="Arial" w:eastAsia="Arial" w:hAnsi="Arial"/>
+          <w:i/>
+          <w:iCs/>
+          <w:sz w:val="22"/>
+          <w:szCs w:val="22"/>
+        </w:rPr>
+        <w:t xml:space="preserve">Tot voltooiing van de migratie (Art. 4.5) gelden de volgende bepalingen:</w:t>
+      </w:r>
+    </w:p>
+    <w:p>
+      <w:pPr>
+        <w:spacing w:before="100" w:after="100"/>
+      </w:pPr>
+      <w:r>
+        <w:rPr>
+          <w:rFonts w:ascii="Arial" w:cs="Arial" w:eastAsia="Arial" w:hAnsi="Arial"/>
+          <w:sz w:val="22"/>
+          <w:szCs w:val="22"/>
+        </w:rPr>
+        <w:t xml:space="preserve"/>
+      </w:r>
+    </w:p>
+    <w:p>
+      <w:pPr>
         <w:spacing w:before="200" w:after="100"/>
       </w:pPr>
       <w:r>
@@ -4013,7 +4043,7 @@
           <w:sz w:val="22"/>
           <w:szCs w:val="22"/>
         </w:rPr>
-        <w:t xml:space="preserve">Op verzoek van Opdrachtgever draagt Opdrachtnemer de hosting- en infrastructuuraccounts eenmalig over naar accounts op naam van Opdrachtgever. Opdrachtgever stelt daartoe de benodigde betaalgegevens (creditcard of automatische incasso) ter beschikking. Opdrachtnemer verzorgt de migratie en levert een infrastructuurdocumentatie op met een overzicht van alle servers, diensten, accounts en bijbehorende kosten.</w:t>
+        <w:t xml:space="preserve">Opdrachtnemer draagt de hosting- en infrastructuuraccounts eenmalig over naar accounts op naam van Opdrachtgever. Opdrachtgever stelt daartoe tijdig de benodigde betaalgegevens (creditcard of automatische incasso) ter beschikking. Opdrachtnemer verzorgt de migratie en levert een infrastructuurdocumentatie op met een overzicht van alle servers, diensten, accounts en bijbehorende kosten.</w:t>
       </w:r>
     </w:p>
     <w:p>

</xml_diff>

<commit_message>
MailPace Solo toegevoegd aan na-migratietabel (Art. 4.1)
Totaal na migratie: ~€28 → ~€31/maand. Email en strategische
notities bijgewerkt met aangepaste bedragen.
</commit_message>
<xml_diff>
--- a/artifacts/KTLO_Overeenkomst_Dienstverlening_v2.docx
+++ b/artifacts/KTLO_Overeenkomst_Dienstverlening_v2.docx
@@ -3746,7 +3746,7 @@
                 <w:sz w:val="20"/>
                 <w:szCs w:val="20"/>
               </w:rPr>
-              <w:t xml:space="preserve">Bewaking (gratis abonnement)</w:t>
+              <w:t xml:space="preserve">E-mailverzending (Solo, 1.000 e-mails/mnd)</w:t>
             </w:r>
           </w:p>
         </w:tc>
@@ -3770,7 +3770,7 @@
                 <w:sz w:val="20"/>
                 <w:szCs w:val="20"/>
               </w:rPr>
-              <w:t xml:space="preserve">AppSignal</w:t>
+              <w:t xml:space="preserve">MailPace</w:t>
             </w:r>
           </w:p>
         </w:tc>
@@ -3794,7 +3794,7 @@
                 <w:sz w:val="20"/>
                 <w:szCs w:val="20"/>
               </w:rPr>
-              <w:t xml:space="preserve">€0,00</w:t>
+              <w:t xml:space="preserve">€3,00</w:t>
             </w:r>
           </w:p>
         </w:tc>
@@ -3817,6 +3817,80 @@
             <w:r>
               <w:rPr>
                 <w:rFonts w:ascii="Arial" w:cs="Arial" w:eastAsia="Arial" w:hAnsi="Arial"/>
+                <w:sz w:val="20"/>
+                <w:szCs w:val="20"/>
+              </w:rPr>
+              <w:t xml:space="preserve">Bewaking (gratis abonnement)</w:t>
+            </w:r>
+          </w:p>
+        </w:tc>
+        <w:tc>
+          <w:tcPr>
+            <w:tcW w:type="dxa" w:w="3000"/>
+            <w:tcBorders>
+              <w:top w:val="single" w:color="999999" w:sz="1"/>
+              <w:left w:val="single" w:color="999999" w:sz="1"/>
+              <w:bottom w:val="single" w:color="999999" w:sz="1"/>
+              <w:right w:val="single" w:color="999999" w:sz="1"/>
+            </w:tcBorders>
+          </w:tcPr>
+          <w:p>
+            <w:pPr>
+              <w:spacing w:before="40" w:after="40"/>
+            </w:pPr>
+            <w:r>
+              <w:rPr>
+                <w:rFonts w:ascii="Arial" w:cs="Arial" w:eastAsia="Arial" w:hAnsi="Arial"/>
+                <w:sz w:val="20"/>
+                <w:szCs w:val="20"/>
+              </w:rPr>
+              <w:t xml:space="preserve">AppSignal</w:t>
+            </w:r>
+          </w:p>
+        </w:tc>
+        <w:tc>
+          <w:tcPr>
+            <w:tcW w:type="dxa" w:w="2860"/>
+            <w:tcBorders>
+              <w:top w:val="single" w:color="999999" w:sz="1"/>
+              <w:left w:val="single" w:color="999999" w:sz="1"/>
+              <w:bottom w:val="single" w:color="999999" w:sz="1"/>
+              <w:right w:val="single" w:color="999999" w:sz="1"/>
+            </w:tcBorders>
+          </w:tcPr>
+          <w:p>
+            <w:pPr>
+              <w:spacing w:before="40" w:after="40"/>
+            </w:pPr>
+            <w:r>
+              <w:rPr>
+                <w:rFonts w:ascii="Arial" w:cs="Arial" w:eastAsia="Arial" w:hAnsi="Arial"/>
+                <w:sz w:val="20"/>
+                <w:szCs w:val="20"/>
+              </w:rPr>
+              <w:t xml:space="preserve">€0,00</w:t>
+            </w:r>
+          </w:p>
+        </w:tc>
+      </w:tr>
+      <w:tr>
+        <w:tc>
+          <w:tcPr>
+            <w:tcW w:type="dxa" w:w="3500"/>
+            <w:tcBorders>
+              <w:top w:val="single" w:color="999999" w:sz="1"/>
+              <w:left w:val="single" w:color="999999" w:sz="1"/>
+              <w:bottom w:val="single" w:color="999999" w:sz="1"/>
+              <w:right w:val="single" w:color="999999" w:sz="1"/>
+            </w:tcBorders>
+          </w:tcPr>
+          <w:p>
+            <w:pPr>
+              <w:spacing w:before="40" w:after="40"/>
+            </w:pPr>
+            <w:r>
+              <w:rPr>
+                <w:rFonts w:ascii="Arial" w:cs="Arial" w:eastAsia="Arial" w:hAnsi="Arial"/>
                 <w:b/>
                 <w:bCs/>
                 <w:sz w:val="20"/>
@@ -3872,7 +3946,7 @@
                 <w:sz w:val="20"/>
                 <w:szCs w:val="20"/>
               </w:rPr>
-              <w:t xml:space="preserve">~€28/maand</w:t>
+              <w:t xml:space="preserve">~€31/maand</w:t>
             </w:r>
           </w:p>
         </w:tc>

</xml_diff>

<commit_message>
MailPace Solo toegevoegd aan huidige hostingtabel (Art. 4.1)
Huidige totaal: ~€123 → ~€126/maand (MailPace €3/mnd was niet meegeteld).
Besparing blijft ~€95/maand (€126 → €31).
</commit_message>
<xml_diff>
--- a/artifacts/KTLO_Overeenkomst_Dienstverlening_v2.docx
+++ b/artifacts/KTLO_Overeenkomst_Dienstverlening_v2.docx
@@ -3110,7 +3110,7 @@
                 <w:sz w:val="20"/>
                 <w:szCs w:val="20"/>
               </w:rPr>
-              <w:t xml:space="preserve">Bewaking (gratis abonnement)</w:t>
+              <w:t xml:space="preserve">E-mailverzending (Solo, 1.000 e-mails/mnd)</w:t>
             </w:r>
           </w:p>
         </w:tc>
@@ -3134,7 +3134,7 @@
                 <w:sz w:val="20"/>
                 <w:szCs w:val="20"/>
               </w:rPr>
-              <w:t xml:space="preserve">AppSignal</w:t>
+              <w:t xml:space="preserve">MailPace</w:t>
             </w:r>
           </w:p>
         </w:tc>
@@ -3158,7 +3158,7 @@
                 <w:sz w:val="20"/>
                 <w:szCs w:val="20"/>
               </w:rPr>
-              <w:t xml:space="preserve">€0,00</w:t>
+              <w:t xml:space="preserve">€3,00</w:t>
             </w:r>
           </w:p>
         </w:tc>
@@ -3181,6 +3181,80 @@
             <w:r>
               <w:rPr>
                 <w:rFonts w:ascii="Arial" w:cs="Arial" w:eastAsia="Arial" w:hAnsi="Arial"/>
+                <w:sz w:val="20"/>
+                <w:szCs w:val="20"/>
+              </w:rPr>
+              <w:t xml:space="preserve">Bewaking (gratis abonnement)</w:t>
+            </w:r>
+          </w:p>
+        </w:tc>
+        <w:tc>
+          <w:tcPr>
+            <w:tcW w:type="dxa" w:w="3000"/>
+            <w:tcBorders>
+              <w:top w:val="single" w:color="999999" w:sz="1"/>
+              <w:left w:val="single" w:color="999999" w:sz="1"/>
+              <w:bottom w:val="single" w:color="999999" w:sz="1"/>
+              <w:right w:val="single" w:color="999999" w:sz="1"/>
+            </w:tcBorders>
+          </w:tcPr>
+          <w:p>
+            <w:pPr>
+              <w:spacing w:before="40" w:after="40"/>
+            </w:pPr>
+            <w:r>
+              <w:rPr>
+                <w:rFonts w:ascii="Arial" w:cs="Arial" w:eastAsia="Arial" w:hAnsi="Arial"/>
+                <w:sz w:val="20"/>
+                <w:szCs w:val="20"/>
+              </w:rPr>
+              <w:t xml:space="preserve">AppSignal</w:t>
+            </w:r>
+          </w:p>
+        </w:tc>
+        <w:tc>
+          <w:tcPr>
+            <w:tcW w:type="dxa" w:w="2860"/>
+            <w:tcBorders>
+              <w:top w:val="single" w:color="999999" w:sz="1"/>
+              <w:left w:val="single" w:color="999999" w:sz="1"/>
+              <w:bottom w:val="single" w:color="999999" w:sz="1"/>
+              <w:right w:val="single" w:color="999999" w:sz="1"/>
+            </w:tcBorders>
+          </w:tcPr>
+          <w:p>
+            <w:pPr>
+              <w:spacing w:before="40" w:after="40"/>
+            </w:pPr>
+            <w:r>
+              <w:rPr>
+                <w:rFonts w:ascii="Arial" w:cs="Arial" w:eastAsia="Arial" w:hAnsi="Arial"/>
+                <w:sz w:val="20"/>
+                <w:szCs w:val="20"/>
+              </w:rPr>
+              <w:t xml:space="preserve">€0,00</w:t>
+            </w:r>
+          </w:p>
+        </w:tc>
+      </w:tr>
+      <w:tr>
+        <w:tc>
+          <w:tcPr>
+            <w:tcW w:type="dxa" w:w="3500"/>
+            <w:tcBorders>
+              <w:top w:val="single" w:color="999999" w:sz="1"/>
+              <w:left w:val="single" w:color="999999" w:sz="1"/>
+              <w:bottom w:val="single" w:color="999999" w:sz="1"/>
+              <w:right w:val="single" w:color="999999" w:sz="1"/>
+            </w:tcBorders>
+          </w:tcPr>
+          <w:p>
+            <w:pPr>
+              <w:spacing w:before="40" w:after="40"/>
+            </w:pPr>
+            <w:r>
+              <w:rPr>
+                <w:rFonts w:ascii="Arial" w:cs="Arial" w:eastAsia="Arial" w:hAnsi="Arial"/>
                 <w:b/>
                 <w:bCs/>
                 <w:sz w:val="20"/>
@@ -3236,7 +3310,7 @@
                 <w:sz w:val="20"/>
                 <w:szCs w:val="20"/>
               </w:rPr>
-              <w:t xml:space="preserve">~$133,65/mnd (~€123)</w:t>
+              <w:t xml:space="preserve">~$133,65 + €3/mnd (~€126)</w:t>
             </w:r>
           </w:p>
         </w:tc>

</xml_diff>